<commit_message>
Add non-functional test coverage (KU-30/KU-31) to PDHUPL_v2.md
Integrate the 4 stress-test runs + RPC capacity probe from
stress-test/README.md into the formal PDHUPL structure as new Bab 6
(5 AU items backing NFR-PAYANA-01 and NFR-PAYANA-07), plus matching
entries in Bab 3.1 identification table, Bab 3.2.1 execution order,
and Bab 4 descriptions. AU-30-01 is reported as PARTIAL (2/3 endpoints
missed the original 500ms P99 target) rather than glossed over, since
that gap is what actually motivated the NFR-PAYANA-01 revision in
SKPL.md. Total test item count updated from 96 to 101.
</commit_message>
<xml_diff>
--- a/docs/PDHUPL_v2.docx
+++ b/docs/PDHUPL_v2.docx
@@ -29,14 +29,30 @@
           <w:i/>
           <w:color w:val="555555"/>
         </w:rPr>
-        <w:t>Catatan:</w:t>
+        <w:t>Sumber acuan UC/FR:</w:t>
       </w:r>
       <w:r>
         <w:rPr>
           <w:i/>
           <w:color w:val="555555"/>
         </w:rPr>
-        <w:t xml:space="preserve"> Bab 1 (Pendahuluan) diisi manual oleh penulis. </w:t>
+        <w:t xml:space="preserve"> </w:t>
+      </w:r>
+      <w:r>
+        <w:rPr>
+          <w:rFonts w:ascii="Consolas" w:hAnsi="Consolas"/>
+          <w:i/>
+          <w:color w:val="555555"/>
+          <w:sz w:val="18"/>
+        </w:rPr>
+        <w:t>payroll-web3-saas/docs/SKPL.md</w:t>
+      </w:r>
+      <w:r>
+        <w:rPr>
+          <w:i/>
+          <w:color w:val="555555"/>
+        </w:rPr>
+        <w:t xml:space="preserve"> (UC-01 s.d. UC-29, FR-PAYANA-101 s.d. FR-PAYANA-2001, NFR-PAYANA-01 s.d. NFR-PAYANA-10). Nomor KU-17/18/19 tidak digunakan (dicadangkan, tidak dialokasikan untuk modul mana pun) — penomoran KU-01 s.d. KU-29 lainnya berurutan; KU-30/KU-31 (Bab 6) adalah pengujian non-fungsional (NFR), terpisah dari penomoran fungsional di atas. Seluruh </w:t>
       </w:r>
       <w:r>
         <w:rPr>
@@ -44,30 +60,14 @@
           <w:i/>
           <w:color w:val="555555"/>
         </w:rPr>
-        <w:t>Sumber acuan UC/FR:</w:t>
+        <w:t>101 butir uji</w:t>
       </w:r>
       <w:r>
         <w:rPr>
           <w:i/>
           <w:color w:val="555555"/>
         </w:rPr>
-        <w:t xml:space="preserve"> </w:t>
-      </w:r>
-      <w:r>
-        <w:rPr>
-          <w:rFonts w:ascii="Consolas" w:hAnsi="Consolas"/>
-          <w:i/>
-          <w:color w:val="555555"/>
-          <w:sz w:val="18"/>
-        </w:rPr>
-        <w:t>payroll-web3-saas/docs/SKPL.md</w:t>
-      </w:r>
-      <w:r>
-        <w:rPr>
-          <w:i/>
-          <w:color w:val="555555"/>
-        </w:rPr>
-        <w:t xml:space="preserve"> (UC-01 s.d. UC-29, FR-PAYANA-101 s.d. FR-PAYANA-2001). Nomor KU-17/18/19 tidak digunakan (dicadangkan, tidak dialokasikan untuk modul mana pun) — penomoran KU-01 s.d. KU-29 lainnya berurutan. Seluruh 96 butir uji pada dokumen ini berstatus </w:t>
+        <w:t xml:space="preserve"> pada dokumen ini (96 fungsional di Bab 5 + 5 non-fungsional di Bab 6) berstatus </w:t>
       </w:r>
       <w:r>
         <w:rPr>
@@ -82,7 +82,7 @@
           <w:i/>
           <w:color w:val="555555"/>
         </w:rPr>
-        <w:t xml:space="preserve"> — lihat Bab 5 untuk detail hasil dan bukti eksekusi tiap butir.</w:t>
+        <w:t xml:space="preserve"> — lihat Bab 5 dan Bab 6 untuk detail hasil dan bukti eksekusi tiap butir.</w:t>
       </w:r>
     </w:p>
     <w:p>
@@ -100,15 +100,121 @@
     </w:p>
     <w:p>
       <w:pPr>
-        <w:spacing w:after="160"/>
-        <w:ind w:left="576"/>
+        <w:pStyle w:val="Heading3"/>
       </w:pPr>
       <w:r>
+        <w:t>1.1 Tujuan</w:t>
+      </w:r>
+    </w:p>
+    <w:p>
+      <w:pPr>
+        <w:spacing w:after="120"/>
+      </w:pPr>
+      <w:r>
+        <w:t xml:space="preserve">Dokumen Perencanaan dan Deskripsi Hasil Uji Perangkat Lunak (PDHUPL) ini disusun untuk merencanakan, mendokumentasikan, dan melaporkan hasil pengujian sistem </w:t>
+      </w:r>
+      <w:r>
+        <w:rPr>
+          <w:b/>
+        </w:rPr>
+        <w:t>Payana</w:t>
+      </w:r>
+      <w:r>
+        <w:t xml:space="preserve"> — platform payroll terdesentralisasi berbasis smart contract yang dikembangkan sebagai proyek penelitian skripsi pada Program Studi Informatika, Universitas Atma Jaya Yogyakarta.</w:t>
+      </w:r>
+    </w:p>
+    <w:p>
+      <w:pPr>
+        <w:spacing w:after="120"/>
+      </w:pPr>
+      <w:r>
+        <w:t>Tujuan penulisan dokumen ini mencakup:</w:t>
+      </w:r>
+    </w:p>
+    <w:p>
+      <w:pPr>
+        <w:pStyle w:val="ListNumber"/>
+      </w:pPr>
+      <w:r>
+        <w:t xml:space="preserve">Merencanakan lingkup, lingkungan, dan metodologi pengujian yang akan digunakan untuk memverifikasi bahwa implementasi Payana memenuhi seluruh kebutuhan fungsional (FR-PAYANA-xxx) dan use case (UC-01 s.d. UC-29) yang telah didefinisikan di </w:t>
+      </w:r>
+      <w:r>
+        <w:rPr>
+          <w:rFonts w:ascii="Consolas" w:hAnsi="Consolas"/>
+          <w:color w:val="C7254E"/>
+          <w:sz w:val="18"/>
+        </w:rPr>
+        <w:t>SKPL.md</w:t>
+      </w:r>
+      <w:r>
+        <w:t>.</w:t>
+      </w:r>
+    </w:p>
+    <w:p>
+      <w:pPr>
+        <w:pStyle w:val="ListNumber"/>
+      </w:pPr>
+      <w:r>
+        <w:t>Menjabarkan setiap kasus uji (KU) dan butir uji (AU) secara terukur — mencakup input, hasil yang diharapkan, dan hasil yang benar-benar didapat — sehingga pengujian dapat direproduksi dan diverifikasi ulang oleh pihak lain (dosen pembimbing, penguji, atau pengembang selanjutnya).</w:t>
+      </w:r>
+    </w:p>
+    <w:p>
+      <w:pPr>
+        <w:pStyle w:val="ListNumber"/>
+      </w:pPr>
+      <w:r>
+        <w:t>Mendokumentasikan traceability dua arah antara kebutuhan (SKPL), rancangan (DPPL), dan hasil pengujian nyata, sehingga setiap FR/UC yang diklaim "terpenuhi" memiliki bukti eksekusi yang dapat ditelusuri kembali.</w:t>
+      </w:r>
+    </w:p>
+    <w:p>
+      <w:pPr>
+        <w:pStyle w:val="ListNumber"/>
+      </w:pPr>
+      <w:r>
+        <w:t>Melaporkan hasil pengujian secara jujur apa adanya — termasuk defect yang ditemukan dan diperbaiki selama proses pengujian (lihat catatan temuan di Bab 5) — bukan sekadar checklist yang menyatakan seluruh butir "lolos" tanpa bukti pendukung.</w:t>
+      </w:r>
+    </w:p>
+    <w:p>
+      <w:pPr>
+        <w:pStyle w:val="ListNumber"/>
+      </w:pPr>
+      <w:r>
+        <w:t>Menjadi bahan evaluasi bagi dosen pembimbing dan penguji sidang mengenai kematangan (readiness) sistem Payana sebagai purwarupa penelitian, termasuk keterbatasan yang secara sadar belum tercakup dalam pengujian ini (lihat Bab 6 — jika ada — atau catatan cakupan di tiap kasus uji).</w:t>
+      </w:r>
+    </w:p>
+    <w:p>
+      <w:pPr>
+        <w:spacing w:after="120"/>
+      </w:pPr>
+      <w:r>
+        <w:t xml:space="preserve">Dokumen ini disusun dengan mengacu pada struktur template PDHUPL yang berlaku di Program Studi Informatika UAJY, dengan adaptasi terhadap konteks pengujian sistem berbasis blockchain — kombinasi pengujian </w:t>
+      </w:r>
+      <w:r>
         <w:rPr>
           <w:i/>
-          <w:color w:val="555555"/>
-        </w:rPr>
-        <w:t>Diisi manual oleh penulis (lihat catatan di kepala dokumen). Kerangka subbab di bawah mengikuti struktur resmi template PDHUPL sehingga tidak ada subbab yang hilang saat penulis mengisi konten Bab 1.</w:t>
+        </w:rPr>
+        <w:t>white-box</w:t>
+      </w:r>
+      <w:r>
+        <w:t>/</w:t>
+      </w:r>
+      <w:r>
+        <w:rPr>
+          <w:i/>
+        </w:rPr>
+        <w:t>gray-box</w:t>
+      </w:r>
+      <w:r>
+        <w:t xml:space="preserve"> pada lapisan smart contract (Foundry) dan pengujian </w:t>
+      </w:r>
+      <w:r>
+        <w:rPr>
+          <w:i/>
+        </w:rPr>
+        <w:t>black-box</w:t>
+      </w:r>
+      <w:r>
+        <w:t xml:space="preserve"> murni pada lapisan integrasi/sistem (API, UI) — lihat Bab 2.1 untuk penjelasan metodologi lengkap.</w:t>
       </w:r>
     </w:p>
     <w:p>
@@ -116,7 +222,7 @@
         <w:pStyle w:val="Heading3"/>
       </w:pPr>
       <w:r>
-        <w:t>1.1 Tujuan</w:t>
+        <w:t>1.2 Deskripsi Umum Sistem</w:t>
       </w:r>
     </w:p>
     <w:p>
@@ -124,10 +230,274 @@
         <w:spacing w:after="120"/>
       </w:pPr>
       <w:r>
+        <w:t xml:space="preserve">Payana adalah platform penggajian (payroll) real-time terdesentralisasi berbasis blockchain untuk perusahaan berskala 50–500 karyawan di Indonesia, beroperasi di atas jaringan </w:t>
+      </w:r>
+      <w:r>
+        <w:rPr>
+          <w:b/>
+        </w:rPr>
+        <w:t>Base Sepolia</w:t>
+      </w:r>
+      <w:r>
+        <w:t xml:space="preserve"> (Ethereum Layer-2 testnet, Chain ID 84532) dan menggunakan stablecoin </w:t>
+      </w:r>
+      <w:r>
+        <w:rPr>
+          <w:b/>
+        </w:rPr>
+        <w:t>IDRX</w:t>
+      </w:r>
+      <w:r>
+        <w:t xml:space="preserve"> (ERC-20 berpegged Rupiah, 1 IDRX = 1 IDR) sebagai medium pembayaran gaji. Sistem terdiri atas empat lapisan yang diuji dengan pendekatan berbeda sesuai karakteristiknya masing-masing (lihat Bab 2.1):</w:t>
+      </w:r>
+    </w:p>
+    <w:p>
+      <w:pPr>
+        <w:pStyle w:val="ListNumber"/>
+      </w:pPr>
+      <w:r>
+        <w:rPr>
+          <w:b/>
+        </w:rPr>
+        <w:t>Lapisan Smart Contract</w:t>
+      </w:r>
+      <w:r>
+        <w:t xml:space="preserve"> (</w:t>
+      </w:r>
+      <w:r>
+        <w:rPr>
+          <w:rFonts w:ascii="Consolas" w:hAnsi="Consolas"/>
+          <w:color w:val="C7254E"/>
+          <w:sz w:val="18"/>
+        </w:rPr>
+        <w:t>finley-payroll/</w:t>
+      </w:r>
+      <w:r>
+        <w:t xml:space="preserve">) — tiga kontrak Solidity ter-deploy: </w:t>
+      </w:r>
+      <w:r>
+        <w:rPr>
+          <w:rFonts w:ascii="Consolas" w:hAnsi="Consolas"/>
+          <w:color w:val="C7254E"/>
+          <w:sz w:val="18"/>
+        </w:rPr>
+        <w:t>PayrollFactory</w:t>
+      </w:r>
+      <w:r>
+        <w:t xml:space="preserve"> (entry-point multi-tenant), </w:t>
+      </w:r>
+      <w:r>
+        <w:rPr>
+          <w:rFonts w:ascii="Consolas" w:hAnsi="Consolas"/>
+          <w:color w:val="C7254E"/>
+          <w:sz w:val="18"/>
+        </w:rPr>
+        <w:t>CompanyVault</w:t>
+      </w:r>
+      <w:r>
+        <w:t xml:space="preserve"> (logika inti per perusahaan: streaming gaji, klaim EWA, PHK multi-tanda tangan, cliff vesting, kasbon, mesin pajak PPh21/BPJS, sekaligus Paymaster ERC-4337), dan </w:t>
+      </w:r>
+      <w:r>
+        <w:rPr>
+          <w:rFonts w:ascii="Consolas" w:hAnsi="Consolas"/>
+          <w:color w:val="C7254E"/>
+          <w:sz w:val="18"/>
+        </w:rPr>
+        <w:t>EmploymentSBT</w:t>
+      </w:r>
+      <w:r>
+        <w:t xml:space="preserve"> (sertifikat ketenagakerjaan soulbound ERC-5192). Diuji secara </w:t>
+      </w:r>
+      <w:r>
         <w:rPr>
           <w:i/>
         </w:rPr>
-        <w:t>(diisi manual oleh penulis)</w:t>
+        <w:t>white-box</w:t>
+      </w:r>
+      <w:r>
+        <w:t>/</w:t>
+      </w:r>
+      <w:r>
+        <w:rPr>
+          <w:i/>
+        </w:rPr>
+        <w:t>gray-box</w:t>
+      </w:r>
+      <w:r>
+        <w:t xml:space="preserve"> memakai Foundry.</w:t>
+      </w:r>
+    </w:p>
+    <w:p>
+      <w:pPr>
+        <w:pStyle w:val="ListNumber"/>
+      </w:pPr>
+      <w:r>
+        <w:rPr>
+          <w:b/>
+        </w:rPr>
+        <w:t>Lapisan Backend API</w:t>
+      </w:r>
+      <w:r>
+        <w:t xml:space="preserve"> (</w:t>
+      </w:r>
+      <w:r>
+        <w:rPr>
+          <w:rFonts w:ascii="Consolas" w:hAnsi="Consolas"/>
+          <w:color w:val="C7254E"/>
+          <w:sz w:val="18"/>
+        </w:rPr>
+        <w:t>backend/</w:t>
+      </w:r>
+      <w:r>
+        <w:t xml:space="preserve">) — REST API berbasis Express yang menangani autentikasi EIP-191, relay UserOperation gasless, pelaporan kepatuhan, registrasi tenant, webhook Alchemy, dan belasan grup route fitur off-chain (reimburse, bounty, payslip, tax cert, dll. — lihat </w:t>
+      </w:r>
+      <w:r>
+        <w:rPr>
+          <w:rFonts w:ascii="Consolas" w:hAnsi="Consolas"/>
+          <w:color w:val="C7254E"/>
+          <w:sz w:val="18"/>
+        </w:rPr>
+        <w:t>DPPL.md</w:t>
+      </w:r>
+      <w:r>
+        <w:t xml:space="preserve"> Lampiran B). Diuji </w:t>
+      </w:r>
+      <w:r>
+        <w:rPr>
+          <w:i/>
+        </w:rPr>
+        <w:t>black-box</w:t>
+      </w:r>
+      <w:r>
+        <w:t xml:space="preserve"> lewat panggilan HTTP langsung.</w:t>
+      </w:r>
+    </w:p>
+    <w:p>
+      <w:pPr>
+        <w:pStyle w:val="ListNumber"/>
+      </w:pPr>
+      <w:r>
+        <w:rPr>
+          <w:b/>
+        </w:rPr>
+        <w:t>Lapisan Ponder Indexer</w:t>
+      </w:r>
+      <w:r>
+        <w:t xml:space="preserve"> (</w:t>
+      </w:r>
+      <w:r>
+        <w:rPr>
+          <w:rFonts w:ascii="Consolas" w:hAnsi="Consolas"/>
+          <w:color w:val="C7254E"/>
+          <w:sz w:val="18"/>
+        </w:rPr>
+        <w:t>ponder/</w:t>
+      </w:r>
+      <w:r>
+        <w:t>) — mengindeks event on-chain ke PostgreSQL untuk dikonsumsi frontend/backend secara efisien.</w:t>
+      </w:r>
+    </w:p>
+    <w:p>
+      <w:pPr>
+        <w:pStyle w:val="ListNumber"/>
+      </w:pPr>
+      <w:r>
+        <w:rPr>
+          <w:b/>
+        </w:rPr>
+        <w:t>Lapisan Frontend</w:t>
+      </w:r>
+      <w:r>
+        <w:t xml:space="preserve"> (</w:t>
+      </w:r>
+      <w:r>
+        <w:rPr>
+          <w:rFonts w:ascii="Consolas" w:hAnsi="Consolas"/>
+          <w:color w:val="C7254E"/>
+          <w:sz w:val="18"/>
+        </w:rPr>
+        <w:t>frontend/</w:t>
+      </w:r>
+      <w:r>
+        <w:t xml:space="preserve">) — portal Next.js yang dipisah berdasarkan peran (HR Admin, Karyawan, Owner SaaS — lihat </w:t>
+      </w:r>
+      <w:r>
+        <w:rPr>
+          <w:rFonts w:ascii="Consolas" w:hAnsi="Consolas"/>
+          <w:color w:val="C7254E"/>
+          <w:sz w:val="18"/>
+        </w:rPr>
+        <w:t>SKPL.md</w:t>
+      </w:r>
+      <w:r>
+        <w:t xml:space="preserve"> §3.1 untuk catatan soal peran Legal Officer yang tidak punya dashboard terpisah). Diuji </w:t>
+      </w:r>
+      <w:r>
+        <w:rPr>
+          <w:i/>
+        </w:rPr>
+        <w:t>black-box</w:t>
+      </w:r>
+      <w:r>
+        <w:t xml:space="preserve"> lewat klik-UI manual di browser sungguhan, bukan hanya inspeksi kode.</w:t>
+      </w:r>
+    </w:p>
+    <w:p>
+      <w:pPr>
+        <w:spacing w:after="120"/>
+      </w:pPr>
+      <w:r>
+        <w:t xml:space="preserve">Ruang lingkup pengujian pada dokumen ini mencakup seluruh 29 use case (dengan penomoran KU-01 s.d. KU-29, tidak berurutan sempurna karena nomor KU-17/18/19 dicadangkan/tidak dipakai — lihat catatan di kepala dokumen) yang terdefinisi di </w:t>
+      </w:r>
+      <w:r>
+        <w:rPr>
+          <w:rFonts w:ascii="Consolas" w:hAnsi="Consolas"/>
+          <w:color w:val="C7254E"/>
+          <w:sz w:val="18"/>
+        </w:rPr>
+        <w:t>SKPL.md</w:t>
+      </w:r>
+      <w:r>
+        <w:t>, mencakup baik jalur sukses (</w:t>
+      </w:r>
+      <w:r>
+        <w:rPr>
+          <w:i/>
+        </w:rPr>
+        <w:t>happy path</w:t>
+      </w:r>
+      <w:r>
+        <w:t xml:space="preserve">), jalur alternatif, maupun kondisi gagal/negatif (validasi, access control, dan kasus tepi). Pengujian non-fungsional (performa/stress test) didokumentasikan terpisah di </w:t>
+      </w:r>
+      <w:r>
+        <w:rPr>
+          <w:rFonts w:ascii="Consolas" w:hAnsi="Consolas"/>
+          <w:color w:val="C7254E"/>
+          <w:sz w:val="18"/>
+        </w:rPr>
+        <w:t>stress-test/README.md</w:t>
+      </w:r>
+      <w:r>
+        <w:t xml:space="preserve"> dan dirujuk pada bagian relevan bila berkaitan langsung dengan butir uji fungsional di dokumen ini.</w:t>
+      </w:r>
+    </w:p>
+    <w:p>
+      <w:pPr>
+        <w:spacing w:after="120"/>
+      </w:pPr>
+      <w:r>
+        <w:t xml:space="preserve">Di luar ruang lingkup pengujian ini: fitur yang secara eksplisit dinyatakan di luar cakupan MVP pada </w:t>
+      </w:r>
+      <w:r>
+        <w:rPr>
+          <w:rFonts w:ascii="Consolas" w:hAnsi="Consolas"/>
+          <w:color w:val="C7254E"/>
+          <w:sz w:val="18"/>
+        </w:rPr>
+        <w:t>SKPL.md</w:t>
+      </w:r>
+      <w:r>
+        <w:t xml:space="preserve"> §1.2 (integrasi HRIS pihak ketiga, fiat on/off ramp, payroll multi-chain, dsb.), serta lingkungan mainnet produksi — seluruh pengujian dilakukan di jaringan testnet Base Sepolia tanpa nilai ekonomi nyata.</w:t>
       </w:r>
     </w:p>
     <w:p>
@@ -135,18 +505,1215 @@
         <w:pStyle w:val="Heading3"/>
       </w:pPr>
       <w:r>
-        <w:t>1.2 Deskripsi Umum Sistem</w:t>
-      </w:r>
+        <w:t>1.3 Definisi, Akronim, Singkatan</w:t>
+      </w:r>
+    </w:p>
+    <w:p>
+      <w:pPr>
+        <w:pStyle w:val="Heading4"/>
+      </w:pPr>
+      <w:r>
+        <w:t>Definisi Khusus Pengujian</w:t>
+      </w:r>
+    </w:p>
+    <w:tbl>
+      <w:tblPr>
+        <w:tblStyle w:val="TableGrid"/>
+        <w:tblW w:type="auto" w:w="0"/>
+        <w:jc w:val="center"/>
+        <w:tblLook w:firstColumn="1" w:firstRow="1" w:lastColumn="0" w:lastRow="0" w:noHBand="0" w:noVBand="1" w:val="04A0"/>
+      </w:tblPr>
+      <w:tblGrid>
+        <w:gridCol w:w="4680"/>
+        <w:gridCol w:w="4680"/>
+      </w:tblGrid>
+      <w:tr>
+        <w:tc>
+          <w:tcPr>
+            <w:tcW w:type="dxa" w:w="4680"/>
+            <w:shd w:val="clear" w:color="auto" w:fill="D9E2F3"/>
+          </w:tcPr>
+          <w:p>
+            <w:r>
+              <w:rPr>
+                <w:b/>
+              </w:rPr>
+            </w:r>
+            <w:r>
+              <w:rPr>
+                <w:b/>
+                <w:sz w:val="18"/>
+              </w:rPr>
+              <w:t>Istilah</w:t>
+            </w:r>
+          </w:p>
+        </w:tc>
+        <w:tc>
+          <w:tcPr>
+            <w:tcW w:type="dxa" w:w="4680"/>
+            <w:shd w:val="clear" w:color="auto" w:fill="D9E2F3"/>
+          </w:tcPr>
+          <w:p>
+            <w:r>
+              <w:rPr>
+                <w:b/>
+              </w:rPr>
+            </w:r>
+            <w:r>
+              <w:rPr>
+                <w:b/>
+                <w:sz w:val="18"/>
+              </w:rPr>
+              <w:t>Definisi</w:t>
+            </w:r>
+          </w:p>
+        </w:tc>
+      </w:tr>
+      <w:tr>
+        <w:tc>
+          <w:tcPr>
+            <w:tcW w:type="dxa" w:w="4680"/>
+          </w:tcPr>
+          <w:p>
+            <w:r>
+              <w:rPr>
+                <w:sz w:val="18"/>
+              </w:rPr>
+              <w:t>Kasus Uji (KU)</w:t>
+            </w:r>
+          </w:p>
+        </w:tc>
+        <w:tc>
+          <w:tcPr>
+            <w:tcW w:type="dxa" w:w="4680"/>
+          </w:tcPr>
+          <w:p>
+            <w:r>
+              <w:rPr>
+                <w:sz w:val="18"/>
+              </w:rPr>
+              <w:t>Satu kelompok pengujian yang menguji satu use case atau satu unit fungsional tertentu (mis. "KU-05 Klaim Gaji EWA"); satu KU dapat terdiri atas beberapa butir uji (AU).</w:t>
+            </w:r>
+          </w:p>
+        </w:tc>
+      </w:tr>
+      <w:tr>
+        <w:tc>
+          <w:tcPr>
+            <w:tcW w:type="dxa" w:w="4680"/>
+          </w:tcPr>
+          <w:p>
+            <w:r>
+              <w:rPr>
+                <w:sz w:val="18"/>
+              </w:rPr>
+              <w:t>Butir/Aktivitas Uji (AU)</w:t>
+            </w:r>
+          </w:p>
+        </w:tc>
+        <w:tc>
+          <w:tcPr>
+            <w:tcW w:type="dxa" w:w="4680"/>
+          </w:tcPr>
+          <w:p>
+            <w:r>
+              <w:rPr>
+                <w:sz w:val="18"/>
+              </w:rPr>
+              <w:t xml:space="preserve">Satu skenario pengujian konkret dengan input, hasil yang diharapkan, dan hasil yang didapat secara spesifik (mis. "AU-05-01" untuk skenario klaim gaji tanpa kasbon aktif); penomoran mengikuti format </w:t>
+            </w:r>
+            <w:r>
+              <w:rPr>
+                <w:rFonts w:ascii="Consolas" w:hAnsi="Consolas"/>
+                <w:color w:val="C7254E"/>
+                <w:sz w:val="18"/>
+              </w:rPr>
+              <w:t>AU-&lt;nomor KU&gt;-&lt;urutan&gt;</w:t>
+            </w:r>
+            <w:r>
+              <w:rPr>
+                <w:sz w:val="18"/>
+              </w:rPr>
+              <w:t>.</w:t>
+            </w:r>
+          </w:p>
+        </w:tc>
+      </w:tr>
+      <w:tr>
+        <w:tc>
+          <w:tcPr>
+            <w:tcW w:type="dxa" w:w="4680"/>
+          </w:tcPr>
+          <w:p>
+            <w:r>
+              <w:rPr>
+                <w:sz w:val="18"/>
+              </w:rPr>
+              <w:t>Status "Handal"</w:t>
+            </w:r>
+          </w:p>
+        </w:tc>
+        <w:tc>
+          <w:tcPr>
+            <w:tcW w:type="dxa" w:w="4680"/>
+          </w:tcPr>
+          <w:p>
+            <w:r>
+              <w:rPr>
+                <w:sz w:val="18"/>
+              </w:rPr>
+              <w:t>Status akhir sebuah butir uji yang menyatakan hasil yang didapat sesuai hasil yang diharapkan, dan telah diverifikasi lewat eksekusi nyata (bukan hanya inspeksi kode atau asumsi).</w:t>
+            </w:r>
+          </w:p>
+        </w:tc>
+      </w:tr>
+      <w:tr>
+        <w:tc>
+          <w:tcPr>
+            <w:tcW w:type="dxa" w:w="4680"/>
+          </w:tcPr>
+          <w:p>
+            <w:r>
+              <w:rPr>
+                <w:sz w:val="18"/>
+              </w:rPr>
+              <w:t xml:space="preserve">Status </w:t>
+            </w:r>
+            <w:r>
+              <w:rPr>
+                <w:rFonts w:ascii="Consolas" w:hAnsi="Consolas"/>
+                <w:color w:val="C7254E"/>
+                <w:sz w:val="18"/>
+              </w:rPr>
+              <w:t>[BELUM DIEKSEKUSI]</w:t>
+            </w:r>
+          </w:p>
+        </w:tc>
+        <w:tc>
+          <w:tcPr>
+            <w:tcW w:type="dxa" w:w="4680"/>
+          </w:tcPr>
+          <w:p>
+            <w:r>
+              <w:rPr>
+                <w:sz w:val="18"/>
+              </w:rPr>
+              <w:t>Status sementara sebuah butir uji yang secara eksplisit belum/tidak dapat dieksekusi pada sesi pengujian ini, disertai alasan spesifik kenapa belum tercakup — dipakai untuk menghindari klaim cakupan pengujian yang melebih-lebihkan (lihat catatan metodologi Bab 5).</w:t>
+            </w:r>
+          </w:p>
+        </w:tc>
+      </w:tr>
+      <w:tr>
+        <w:tc>
+          <w:tcPr>
+            <w:tcW w:type="dxa" w:w="4680"/>
+          </w:tcPr>
+          <w:p>
+            <w:r>
+              <w:rPr>
+                <w:sz w:val="18"/>
+              </w:rPr>
+              <w:t>Pengujian Unit</w:t>
+            </w:r>
+          </w:p>
+        </w:tc>
+        <w:tc>
+          <w:tcPr>
+            <w:tcW w:type="dxa" w:w="4680"/>
+          </w:tcPr>
+          <w:p>
+            <w:r>
+              <w:rPr>
+                <w:sz w:val="18"/>
+              </w:rPr>
+              <w:t>Pengujian pada level fungsi/kontrak individual secara terisolasi, dijalankan dengan Foundry (</w:t>
+            </w:r>
+            <w:r>
+              <w:rPr>
+                <w:rFonts w:ascii="Consolas" w:hAnsi="Consolas"/>
+                <w:color w:val="C7254E"/>
+                <w:sz w:val="18"/>
+              </w:rPr>
+              <w:t>forge test</w:t>
+            </w:r>
+            <w:r>
+              <w:rPr>
+                <w:sz w:val="18"/>
+              </w:rPr>
+              <w:t xml:space="preserve">) pada lingkungan EVM lokal; bersifat </w:t>
+            </w:r>
+            <w:r>
+              <w:rPr>
+                <w:i/>
+                <w:sz w:val="18"/>
+              </w:rPr>
+              <w:t>white-box</w:t>
+            </w:r>
+            <w:r>
+              <w:rPr>
+                <w:sz w:val="18"/>
+              </w:rPr>
+              <w:t>/</w:t>
+            </w:r>
+            <w:r>
+              <w:rPr>
+                <w:i/>
+                <w:sz w:val="18"/>
+              </w:rPr>
+              <w:t>gray-box</w:t>
+            </w:r>
+            <w:r>
+              <w:rPr>
+                <w:sz w:val="18"/>
+              </w:rPr>
+              <w:t xml:space="preserve"> — lihat Bab 2.1.</w:t>
+            </w:r>
+          </w:p>
+        </w:tc>
+      </w:tr>
+      <w:tr>
+        <w:tc>
+          <w:tcPr>
+            <w:tcW w:type="dxa" w:w="4680"/>
+          </w:tcPr>
+          <w:p>
+            <w:r>
+              <w:rPr>
+                <w:sz w:val="18"/>
+              </w:rPr>
+              <w:t>Pengujian Integration</w:t>
+            </w:r>
+          </w:p>
+        </w:tc>
+        <w:tc>
+          <w:tcPr>
+            <w:tcW w:type="dxa" w:w="4680"/>
+          </w:tcPr>
+          <w:p>
+            <w:r>
+              <w:rPr>
+                <w:sz w:val="18"/>
+              </w:rPr>
+              <w:t>Pengujian yang memverifikasi interaksi antar-komponen (mis. backend ↔ smart contract ↔ Ponder) lewat panggilan API/kontrak nyata, tanpa melalui antarmuka klik-UI.</w:t>
+            </w:r>
+          </w:p>
+        </w:tc>
+      </w:tr>
+      <w:tr>
+        <w:tc>
+          <w:tcPr>
+            <w:tcW w:type="dxa" w:w="4680"/>
+          </w:tcPr>
+          <w:p>
+            <w:r>
+              <w:rPr>
+                <w:sz w:val="18"/>
+              </w:rPr>
+              <w:t>Pengujian System</w:t>
+            </w:r>
+          </w:p>
+        </w:tc>
+        <w:tc>
+          <w:tcPr>
+            <w:tcW w:type="dxa" w:w="4680"/>
+          </w:tcPr>
+          <w:p>
+            <w:r>
+              <w:rPr>
+                <w:sz w:val="18"/>
+              </w:rPr>
+              <w:t>Pengujian menyeluruh atas alur pengguna end-to-end, mencakup seluruh lapisan (frontend → backend → smart contract) sekaligus, baik lewat skrip otomatis (</w:t>
+            </w:r>
+            <w:r>
+              <w:rPr>
+                <w:rFonts w:ascii="Consolas" w:hAnsi="Consolas"/>
+                <w:color w:val="C7254E"/>
+                <w:sz w:val="18"/>
+              </w:rPr>
+              <w:t>testing-scripts/</w:t>
+            </w:r>
+            <w:r>
+              <w:rPr>
+                <w:sz w:val="18"/>
+              </w:rPr>
+              <w:t>) maupun klik-UI manual di browser sungguhan.</w:t>
+            </w:r>
+          </w:p>
+        </w:tc>
+      </w:tr>
+      <w:tr>
+        <w:tc>
+          <w:tcPr>
+            <w:tcW w:type="dxa" w:w="4680"/>
+          </w:tcPr>
+          <w:p>
+            <w:r>
+              <w:rPr>
+                <w:sz w:val="18"/>
+              </w:rPr>
+              <w:t>Black-Box Testing</w:t>
+            </w:r>
+          </w:p>
+        </w:tc>
+        <w:tc>
+          <w:tcPr>
+            <w:tcW w:type="dxa" w:w="4680"/>
+          </w:tcPr>
+          <w:p>
+            <w:r>
+              <w:rPr>
+                <w:sz w:val="18"/>
+              </w:rPr>
+              <w:t>Metodologi pengujian yang memverifikasi perilaku sistem murni dari sisi antarmuka publik (input/output yang teramati pengguna), tanpa bergantung pada pengetahuan implementasi internal.</w:t>
+            </w:r>
+          </w:p>
+        </w:tc>
+      </w:tr>
+      <w:tr>
+        <w:tc>
+          <w:tcPr>
+            <w:tcW w:type="dxa" w:w="4680"/>
+          </w:tcPr>
+          <w:p>
+            <w:r>
+              <w:rPr>
+                <w:sz w:val="18"/>
+              </w:rPr>
+              <w:t>White-Box / Gray-Box Testing</w:t>
+            </w:r>
+          </w:p>
+        </w:tc>
+        <w:tc>
+          <w:tcPr>
+            <w:tcW w:type="dxa" w:w="4680"/>
+          </w:tcPr>
+          <w:p>
+            <w:r>
+              <w:rPr>
+                <w:sz w:val="18"/>
+              </w:rPr>
+              <w:t>Metodologi pengujian yang secara sengaja memanfaatkan pengetahuan struktur internal implementasi (nama fungsi, state kontrak, custom error) untuk memverifikasi correctness logika secara presisi — dipakai pada level Unit (Foundry) di dokumen ini.</w:t>
+            </w:r>
+          </w:p>
+        </w:tc>
+      </w:tr>
+      <w:tr>
+        <w:tc>
+          <w:tcPr>
+            <w:tcW w:type="dxa" w:w="4680"/>
+          </w:tcPr>
+          <w:p>
+            <w:r>
+              <w:rPr>
+                <w:sz w:val="18"/>
+              </w:rPr>
+              <w:t>Eksekusi Nyata</w:t>
+            </w:r>
+          </w:p>
+        </w:tc>
+        <w:tc>
+          <w:tcPr>
+            <w:tcW w:type="dxa" w:w="4680"/>
+          </w:tcPr>
+          <w:p>
+            <w:r>
+              <w:rPr>
+                <w:sz w:val="18"/>
+              </w:rPr>
+              <w:t>Istilah yang dipakai berulang di Bab 5 untuk menandai bahwa suatu butir uji benar-benar dijalankan terhadap sistem sungguhan (testnet Base Sepolia, database lokal, atau klik-UI browser) — bukan hanya dibaca/diasumsikan dari kode.</w:t>
+            </w:r>
+          </w:p>
+        </w:tc>
+      </w:tr>
+      <w:tr>
+        <w:tc>
+          <w:tcPr>
+            <w:tcW w:type="dxa" w:w="4680"/>
+          </w:tcPr>
+          <w:p>
+            <w:r>
+              <w:rPr>
+                <w:sz w:val="18"/>
+              </w:rPr>
+              <w:t>Regresi</w:t>
+            </w:r>
+          </w:p>
+        </w:tc>
+        <w:tc>
+          <w:tcPr>
+            <w:tcW w:type="dxa" w:w="4680"/>
+          </w:tcPr>
+          <w:p>
+            <w:r>
+              <w:rPr>
+                <w:sz w:val="18"/>
+              </w:rPr>
+              <w:t>Kondisi di mana perbaikan atas satu defect (lihat catatan temuan Bab 5) berpotensi memengaruhi butir uji lain yang sebelumnya sudah Handal; dokumen ini mencatat butir yang terdampak bila regresi semacam itu ditemukan.</w:t>
+            </w:r>
+          </w:p>
+        </w:tc>
+      </w:tr>
+    </w:tbl>
+    <w:p>
+      <w:pPr>
+        <w:spacing w:after="80"/>
+      </w:pPr>
+    </w:p>
+    <w:p>
+      <w:pPr>
+        <w:pStyle w:val="Heading4"/>
+      </w:pPr>
+      <w:r>
+        <w:t>Akronim dan Singkatan</w:t>
+      </w:r>
+    </w:p>
+    <w:tbl>
+      <w:tblPr>
+        <w:tblStyle w:val="TableGrid"/>
+        <w:tblW w:type="auto" w:w="0"/>
+        <w:jc w:val="center"/>
+        <w:tblLook w:firstColumn="1" w:firstRow="1" w:lastColumn="0" w:lastRow="0" w:noHBand="0" w:noVBand="1" w:val="04A0"/>
+      </w:tblPr>
+      <w:tblGrid>
+        <w:gridCol w:w="4680"/>
+        <w:gridCol w:w="4680"/>
+      </w:tblGrid>
+      <w:tr>
+        <w:tc>
+          <w:tcPr>
+            <w:tcW w:type="dxa" w:w="4680"/>
+            <w:shd w:val="clear" w:color="auto" w:fill="D9E2F3"/>
+          </w:tcPr>
+          <w:p>
+            <w:r>
+              <w:rPr>
+                <w:b/>
+              </w:rPr>
+            </w:r>
+            <w:r>
+              <w:rPr>
+                <w:b/>
+                <w:sz w:val="18"/>
+              </w:rPr>
+              <w:t>Akronim</w:t>
+            </w:r>
+          </w:p>
+        </w:tc>
+        <w:tc>
+          <w:tcPr>
+            <w:tcW w:type="dxa" w:w="4680"/>
+            <w:shd w:val="clear" w:color="auto" w:fill="D9E2F3"/>
+          </w:tcPr>
+          <w:p>
+            <w:r>
+              <w:rPr>
+                <w:b/>
+              </w:rPr>
+            </w:r>
+            <w:r>
+              <w:rPr>
+                <w:b/>
+                <w:sz w:val="18"/>
+              </w:rPr>
+              <w:t>Kepanjangan</w:t>
+            </w:r>
+          </w:p>
+        </w:tc>
+      </w:tr>
+      <w:tr>
+        <w:tc>
+          <w:tcPr>
+            <w:tcW w:type="dxa" w:w="4680"/>
+          </w:tcPr>
+          <w:p>
+            <w:r>
+              <w:rPr>
+                <w:sz w:val="18"/>
+              </w:rPr>
+              <w:t>PDHUPL</w:t>
+            </w:r>
+          </w:p>
+        </w:tc>
+        <w:tc>
+          <w:tcPr>
+            <w:tcW w:type="dxa" w:w="4680"/>
+          </w:tcPr>
+          <w:p>
+            <w:r>
+              <w:rPr>
+                <w:sz w:val="18"/>
+              </w:rPr>
+              <w:t>Perencanaan dan Deskripsi Hasil Uji Perangkat Lunak</w:t>
+            </w:r>
+          </w:p>
+        </w:tc>
+      </w:tr>
+      <w:tr>
+        <w:tc>
+          <w:tcPr>
+            <w:tcW w:type="dxa" w:w="4680"/>
+          </w:tcPr>
+          <w:p>
+            <w:r>
+              <w:rPr>
+                <w:sz w:val="18"/>
+              </w:rPr>
+              <w:t>SKPL</w:t>
+            </w:r>
+          </w:p>
+        </w:tc>
+        <w:tc>
+          <w:tcPr>
+            <w:tcW w:type="dxa" w:w="4680"/>
+          </w:tcPr>
+          <w:p>
+            <w:r>
+              <w:rPr>
+                <w:sz w:val="18"/>
+              </w:rPr>
+              <w:t>Spesifikasi Kebutuhan Perangkat Lunak</w:t>
+            </w:r>
+          </w:p>
+        </w:tc>
+      </w:tr>
+      <w:tr>
+        <w:tc>
+          <w:tcPr>
+            <w:tcW w:type="dxa" w:w="4680"/>
+          </w:tcPr>
+          <w:p>
+            <w:r>
+              <w:rPr>
+                <w:sz w:val="18"/>
+              </w:rPr>
+              <w:t>DPPL</w:t>
+            </w:r>
+          </w:p>
+        </w:tc>
+        <w:tc>
+          <w:tcPr>
+            <w:tcW w:type="dxa" w:w="4680"/>
+          </w:tcPr>
+          <w:p>
+            <w:r>
+              <w:rPr>
+                <w:sz w:val="18"/>
+              </w:rPr>
+              <w:t>Deskripsi Perancangan Perangkat Lunak</w:t>
+            </w:r>
+          </w:p>
+        </w:tc>
+      </w:tr>
+      <w:tr>
+        <w:tc>
+          <w:tcPr>
+            <w:tcW w:type="dxa" w:w="4680"/>
+          </w:tcPr>
+          <w:p>
+            <w:r>
+              <w:rPr>
+                <w:sz w:val="18"/>
+              </w:rPr>
+              <w:t>KU</w:t>
+            </w:r>
+          </w:p>
+        </w:tc>
+        <w:tc>
+          <w:tcPr>
+            <w:tcW w:type="dxa" w:w="4680"/>
+          </w:tcPr>
+          <w:p>
+            <w:r>
+              <w:rPr>
+                <w:sz w:val="18"/>
+              </w:rPr>
+              <w:t>Kasus Uji</w:t>
+            </w:r>
+          </w:p>
+        </w:tc>
+      </w:tr>
+      <w:tr>
+        <w:tc>
+          <w:tcPr>
+            <w:tcW w:type="dxa" w:w="4680"/>
+          </w:tcPr>
+          <w:p>
+            <w:r>
+              <w:rPr>
+                <w:sz w:val="18"/>
+              </w:rPr>
+              <w:t>AU</w:t>
+            </w:r>
+          </w:p>
+        </w:tc>
+        <w:tc>
+          <w:tcPr>
+            <w:tcW w:type="dxa" w:w="4680"/>
+          </w:tcPr>
+          <w:p>
+            <w:r>
+              <w:rPr>
+                <w:sz w:val="18"/>
+              </w:rPr>
+              <w:t>Aktivitas Uji / Butir Uji</w:t>
+            </w:r>
+          </w:p>
+        </w:tc>
+      </w:tr>
+      <w:tr>
+        <w:tc>
+          <w:tcPr>
+            <w:tcW w:type="dxa" w:w="4680"/>
+          </w:tcPr>
+          <w:p>
+            <w:r>
+              <w:rPr>
+                <w:sz w:val="18"/>
+              </w:rPr>
+              <w:t>FR</w:t>
+            </w:r>
+          </w:p>
+        </w:tc>
+        <w:tc>
+          <w:tcPr>
+            <w:tcW w:type="dxa" w:w="4680"/>
+          </w:tcPr>
+          <w:p>
+            <w:r>
+              <w:rPr>
+                <w:sz w:val="18"/>
+              </w:rPr>
+              <w:t>Functional Requirement (Kebutuhan Fungsional)</w:t>
+            </w:r>
+          </w:p>
+        </w:tc>
+      </w:tr>
+      <w:tr>
+        <w:tc>
+          <w:tcPr>
+            <w:tcW w:type="dxa" w:w="4680"/>
+          </w:tcPr>
+          <w:p>
+            <w:r>
+              <w:rPr>
+                <w:sz w:val="18"/>
+              </w:rPr>
+              <w:t>UC</w:t>
+            </w:r>
+          </w:p>
+        </w:tc>
+        <w:tc>
+          <w:tcPr>
+            <w:tcW w:type="dxa" w:w="4680"/>
+          </w:tcPr>
+          <w:p>
+            <w:r>
+              <w:rPr>
+                <w:sz w:val="18"/>
+              </w:rPr>
+              <w:t>Use Case</w:t>
+            </w:r>
+          </w:p>
+        </w:tc>
+      </w:tr>
+      <w:tr>
+        <w:tc>
+          <w:tcPr>
+            <w:tcW w:type="dxa" w:w="4680"/>
+          </w:tcPr>
+          <w:p>
+            <w:r>
+              <w:rPr>
+                <w:sz w:val="18"/>
+              </w:rPr>
+              <w:t>EWA</w:t>
+            </w:r>
+          </w:p>
+        </w:tc>
+        <w:tc>
+          <w:tcPr>
+            <w:tcW w:type="dxa" w:w="4680"/>
+          </w:tcPr>
+          <w:p>
+            <w:r>
+              <w:rPr>
+                <w:sz w:val="18"/>
+              </w:rPr>
+              <w:t>Earned Wage Access</w:t>
+            </w:r>
+          </w:p>
+        </w:tc>
+      </w:tr>
+      <w:tr>
+        <w:tc>
+          <w:tcPr>
+            <w:tcW w:type="dxa" w:w="4680"/>
+          </w:tcPr>
+          <w:p>
+            <w:r>
+              <w:rPr>
+                <w:sz w:val="18"/>
+              </w:rPr>
+              <w:t>SBT</w:t>
+            </w:r>
+          </w:p>
+        </w:tc>
+        <w:tc>
+          <w:tcPr>
+            <w:tcW w:type="dxa" w:w="4680"/>
+          </w:tcPr>
+          <w:p>
+            <w:r>
+              <w:rPr>
+                <w:sz w:val="18"/>
+              </w:rPr>
+              <w:t>Soulbound Token</w:t>
+            </w:r>
+          </w:p>
+        </w:tc>
+      </w:tr>
+      <w:tr>
+        <w:tc>
+          <w:tcPr>
+            <w:tcW w:type="dxa" w:w="4680"/>
+          </w:tcPr>
+          <w:p>
+            <w:r>
+              <w:rPr>
+                <w:sz w:val="18"/>
+              </w:rPr>
+              <w:t>PHK</w:t>
+            </w:r>
+          </w:p>
+        </w:tc>
+        <w:tc>
+          <w:tcPr>
+            <w:tcW w:type="dxa" w:w="4680"/>
+          </w:tcPr>
+          <w:p>
+            <w:r>
+              <w:rPr>
+                <w:sz w:val="18"/>
+              </w:rPr>
+              <w:t>Pemutusan Hubungan Kerja</w:t>
+            </w:r>
+          </w:p>
+        </w:tc>
+      </w:tr>
+      <w:tr>
+        <w:tc>
+          <w:tcPr>
+            <w:tcW w:type="dxa" w:w="4680"/>
+          </w:tcPr>
+          <w:p>
+            <w:r>
+              <w:rPr>
+                <w:sz w:val="18"/>
+              </w:rPr>
+              <w:t>TER</w:t>
+            </w:r>
+          </w:p>
+        </w:tc>
+        <w:tc>
+          <w:tcPr>
+            <w:tcW w:type="dxa" w:w="4680"/>
+          </w:tcPr>
+          <w:p>
+            <w:r>
+              <w:rPr>
+                <w:sz w:val="18"/>
+              </w:rPr>
+              <w:t>Tarif Efektif Rata-rata (skema pemotongan PPh21 sesuai PMK 168/2023)</w:t>
+            </w:r>
+          </w:p>
+        </w:tc>
+      </w:tr>
+      <w:tr>
+        <w:tc>
+          <w:tcPr>
+            <w:tcW w:type="dxa" w:w="4680"/>
+          </w:tcPr>
+          <w:p>
+            <w:r>
+              <w:rPr>
+                <w:sz w:val="18"/>
+              </w:rPr>
+              <w:t>BPJS</w:t>
+            </w:r>
+          </w:p>
+        </w:tc>
+        <w:tc>
+          <w:tcPr>
+            <w:tcW w:type="dxa" w:w="4680"/>
+          </w:tcPr>
+          <w:p>
+            <w:r>
+              <w:rPr>
+                <w:sz w:val="18"/>
+              </w:rPr>
+              <w:t>Badan Penyelenggara Jaminan Sosial</w:t>
+            </w:r>
+          </w:p>
+        </w:tc>
+      </w:tr>
+      <w:tr>
+        <w:tc>
+          <w:tcPr>
+            <w:tcW w:type="dxa" w:w="4680"/>
+          </w:tcPr>
+          <w:p>
+            <w:r>
+              <w:rPr>
+                <w:sz w:val="18"/>
+              </w:rPr>
+              <w:t>PPh21</w:t>
+            </w:r>
+          </w:p>
+        </w:tc>
+        <w:tc>
+          <w:tcPr>
+            <w:tcW w:type="dxa" w:w="4680"/>
+          </w:tcPr>
+          <w:p>
+            <w:r>
+              <w:rPr>
+                <w:sz w:val="18"/>
+              </w:rPr>
+              <w:t>Pajak Penghasilan Pasal 21</w:t>
+            </w:r>
+          </w:p>
+        </w:tc>
+      </w:tr>
+      <w:tr>
+        <w:tc>
+          <w:tcPr>
+            <w:tcW w:type="dxa" w:w="4680"/>
+          </w:tcPr>
+          <w:p>
+            <w:r>
+              <w:rPr>
+                <w:sz w:val="18"/>
+              </w:rPr>
+              <w:t>API</w:t>
+            </w:r>
+          </w:p>
+        </w:tc>
+        <w:tc>
+          <w:tcPr>
+            <w:tcW w:type="dxa" w:w="4680"/>
+          </w:tcPr>
+          <w:p>
+            <w:r>
+              <w:rPr>
+                <w:sz w:val="18"/>
+              </w:rPr>
+              <w:t>Application Programming Interface</w:t>
+            </w:r>
+          </w:p>
+        </w:tc>
+      </w:tr>
+      <w:tr>
+        <w:tc>
+          <w:tcPr>
+            <w:tcW w:type="dxa" w:w="4680"/>
+          </w:tcPr>
+          <w:p>
+            <w:r>
+              <w:rPr>
+                <w:sz w:val="18"/>
+              </w:rPr>
+              <w:t>REST</w:t>
+            </w:r>
+          </w:p>
+        </w:tc>
+        <w:tc>
+          <w:tcPr>
+            <w:tcW w:type="dxa" w:w="4680"/>
+          </w:tcPr>
+          <w:p>
+            <w:r>
+              <w:rPr>
+                <w:sz w:val="18"/>
+              </w:rPr>
+              <w:t>Representational State Transfer</w:t>
+            </w:r>
+          </w:p>
+        </w:tc>
+      </w:tr>
+      <w:tr>
+        <w:tc>
+          <w:tcPr>
+            <w:tcW w:type="dxa" w:w="4680"/>
+          </w:tcPr>
+          <w:p>
+            <w:r>
+              <w:rPr>
+                <w:sz w:val="18"/>
+              </w:rPr>
+              <w:t>JWT</w:t>
+            </w:r>
+          </w:p>
+        </w:tc>
+        <w:tc>
+          <w:tcPr>
+            <w:tcW w:type="dxa" w:w="4680"/>
+          </w:tcPr>
+          <w:p>
+            <w:r>
+              <w:rPr>
+                <w:sz w:val="18"/>
+              </w:rPr>
+              <w:t>JSON Web Token</w:t>
+            </w:r>
+          </w:p>
+        </w:tc>
+      </w:tr>
+      <w:tr>
+        <w:tc>
+          <w:tcPr>
+            <w:tcW w:type="dxa" w:w="4680"/>
+          </w:tcPr>
+          <w:p>
+            <w:r>
+              <w:rPr>
+                <w:sz w:val="18"/>
+              </w:rPr>
+              <w:t>RPC</w:t>
+            </w:r>
+          </w:p>
+        </w:tc>
+        <w:tc>
+          <w:tcPr>
+            <w:tcW w:type="dxa" w:w="4680"/>
+          </w:tcPr>
+          <w:p>
+            <w:r>
+              <w:rPr>
+                <w:sz w:val="18"/>
+              </w:rPr>
+              <w:t>Remote Procedure Call</w:t>
+            </w:r>
+          </w:p>
+        </w:tc>
+      </w:tr>
+      <w:tr>
+        <w:tc>
+          <w:tcPr>
+            <w:tcW w:type="dxa" w:w="4680"/>
+          </w:tcPr>
+          <w:p>
+            <w:r>
+              <w:rPr>
+                <w:sz w:val="18"/>
+              </w:rPr>
+              <w:t>EVM</w:t>
+            </w:r>
+          </w:p>
+        </w:tc>
+        <w:tc>
+          <w:tcPr>
+            <w:tcW w:type="dxa" w:w="4680"/>
+          </w:tcPr>
+          <w:p>
+            <w:r>
+              <w:rPr>
+                <w:sz w:val="18"/>
+              </w:rPr>
+              <w:t>Ethereum Virtual Machine</w:t>
+            </w:r>
+          </w:p>
+        </w:tc>
+      </w:tr>
+      <w:tr>
+        <w:tc>
+          <w:tcPr>
+            <w:tcW w:type="dxa" w:w="4680"/>
+          </w:tcPr>
+          <w:p>
+            <w:r>
+              <w:rPr>
+                <w:sz w:val="18"/>
+              </w:rPr>
+              <w:t>HMAC</w:t>
+            </w:r>
+          </w:p>
+        </w:tc>
+        <w:tc>
+          <w:tcPr>
+            <w:tcW w:type="dxa" w:w="4680"/>
+          </w:tcPr>
+          <w:p>
+            <w:r>
+              <w:rPr>
+                <w:sz w:val="18"/>
+              </w:rPr>
+              <w:t>Hash-based Message Authentication Code</w:t>
+            </w:r>
+          </w:p>
+        </w:tc>
+      </w:tr>
+      <w:tr>
+        <w:tc>
+          <w:tcPr>
+            <w:tcW w:type="dxa" w:w="4680"/>
+          </w:tcPr>
+          <w:p>
+            <w:r>
+              <w:rPr>
+                <w:sz w:val="18"/>
+              </w:rPr>
+              <w:t>CEI</w:t>
+            </w:r>
+          </w:p>
+        </w:tc>
+        <w:tc>
+          <w:tcPr>
+            <w:tcW w:type="dxa" w:w="4680"/>
+          </w:tcPr>
+          <w:p>
+            <w:r>
+              <w:rPr>
+                <w:sz w:val="18"/>
+              </w:rPr>
+              <w:t>Checks-Effects-Interactions (pola keamanan smart contract)</w:t>
+            </w:r>
+          </w:p>
+        </w:tc>
+      </w:tr>
+      <w:tr>
+        <w:tc>
+          <w:tcPr>
+            <w:tcW w:type="dxa" w:w="4680"/>
+          </w:tcPr>
+          <w:p>
+            <w:r>
+              <w:rPr>
+                <w:sz w:val="18"/>
+              </w:rPr>
+              <w:t>VU</w:t>
+            </w:r>
+          </w:p>
+        </w:tc>
+        <w:tc>
+          <w:tcPr>
+            <w:tcW w:type="dxa" w:w="4680"/>
+          </w:tcPr>
+          <w:p>
+            <w:r>
+              <w:rPr>
+                <w:sz w:val="18"/>
+              </w:rPr>
+              <w:t>Virtual User (satuan beban pada stress test k6)</w:t>
+            </w:r>
+          </w:p>
+        </w:tc>
+      </w:tr>
+      <w:tr>
+        <w:tc>
+          <w:tcPr>
+            <w:tcW w:type="dxa" w:w="4680"/>
+          </w:tcPr>
+          <w:p>
+            <w:r>
+              <w:rPr>
+                <w:sz w:val="18"/>
+              </w:rPr>
+              <w:t>P99</w:t>
+            </w:r>
+          </w:p>
+        </w:tc>
+        <w:tc>
+          <w:tcPr>
+            <w:tcW w:type="dxa" w:w="4680"/>
+          </w:tcPr>
+          <w:p>
+            <w:r>
+              <w:rPr>
+                <w:sz w:val="18"/>
+              </w:rPr>
+              <w:t>Persentil ke-99 (metrik latensi pada stress test)</w:t>
+            </w:r>
+          </w:p>
+        </w:tc>
+      </w:tr>
+    </w:tbl>
+    <w:p>
+      <w:pPr>
+        <w:spacing w:after="80"/>
+      </w:pPr>
     </w:p>
     <w:p>
       <w:pPr>
         <w:spacing w:after="120"/>
       </w:pPr>
       <w:r>
-        <w:rPr>
-          <w:i/>
-        </w:rPr>
-        <w:t>(diisi manual oleh penulis — dapat merujuk `payroll-web3-saas/docs/SKPL.md` §1.2 Ruang Lingkup dan §2.1 Perspektif Produk sebagai bahan dasar, disesuaikan sudut pandang pengujian)</w:t>
+        <w:t>Definisi domain sistem lain yang dipakai berulang di dokumen ini (</w:t>
+      </w:r>
+      <w:r>
+        <w:rPr>
+          <w:rFonts w:ascii="Consolas" w:hAnsi="Consolas"/>
+          <w:color w:val="C7254E"/>
+          <w:sz w:val="18"/>
+        </w:rPr>
+        <w:t>flowRate</w:t>
+      </w:r>
+      <w:r>
+        <w:t xml:space="preserve">, </w:t>
+      </w:r>
+      <w:r>
+        <w:rPr>
+          <w:rFonts w:ascii="Consolas" w:hAnsi="Consolas"/>
+          <w:color w:val="C7254E"/>
+          <w:sz w:val="18"/>
+        </w:rPr>
+        <w:t>Vault</w:t>
+      </w:r>
+      <w:r>
+        <w:t xml:space="preserve">, </w:t>
+      </w:r>
+      <w:r>
+        <w:rPr>
+          <w:rFonts w:ascii="Consolas" w:hAnsi="Consolas"/>
+          <w:color w:val="C7254E"/>
+          <w:sz w:val="18"/>
+        </w:rPr>
+        <w:t>Kasbon</w:t>
+      </w:r>
+      <w:r>
+        <w:t xml:space="preserve">, </w:t>
+      </w:r>
+      <w:r>
+        <w:rPr>
+          <w:rFonts w:ascii="Consolas" w:hAnsi="Consolas"/>
+          <w:color w:val="C7254E"/>
+          <w:sz w:val="18"/>
+        </w:rPr>
+        <w:t>LEGAL_ROLE</w:t>
+      </w:r>
+      <w:r>
+        <w:t xml:space="preserve">, dsb.) mengikuti definisi yang sudah ditetapkan di </w:t>
+      </w:r>
+      <w:r>
+        <w:rPr>
+          <w:rFonts w:ascii="Consolas" w:hAnsi="Consolas"/>
+          <w:color w:val="C7254E"/>
+          <w:sz w:val="18"/>
+        </w:rPr>
+        <w:t>SKPL.md</w:t>
+      </w:r>
+      <w:r>
+        <w:t xml:space="preserve"> §1.3 — tidak diduplikasi di sini untuk menghindari drift antar dua dokumen; rujuk </w:t>
+      </w:r>
+      <w:r>
+        <w:rPr>
+          <w:rFonts w:ascii="Consolas" w:hAnsi="Consolas"/>
+          <w:color w:val="C7254E"/>
+          <w:sz w:val="18"/>
+        </w:rPr>
+        <w:t>SKPL.md</w:t>
+      </w:r>
+      <w:r>
+        <w:t xml:space="preserve"> bila ada istilah domain yang tidak familiar.</w:t>
       </w:r>
     </w:p>
     <w:p>
@@ -154,37 +1721,505 @@
         <w:pStyle w:val="Heading3"/>
       </w:pPr>
       <w:r>
-        <w:t>1.3 Definisi, Akronim, Singkatan</w:t>
-      </w:r>
+        <w:t>1.4 Referensi</w:t>
+      </w:r>
+    </w:p>
+    <w:tbl>
+      <w:tblPr>
+        <w:tblStyle w:val="TableGrid"/>
+        <w:tblW w:type="auto" w:w="0"/>
+        <w:jc w:val="center"/>
+        <w:tblLook w:firstColumn="1" w:firstRow="1" w:lastColumn="0" w:lastRow="0" w:noHBand="0" w:noVBand="1" w:val="04A0"/>
+      </w:tblPr>
+      <w:tblGrid>
+        <w:gridCol w:w="3120"/>
+        <w:gridCol w:w="3120"/>
+        <w:gridCol w:w="3120"/>
+      </w:tblGrid>
+      <w:tr>
+        <w:tc>
+          <w:tcPr>
+            <w:tcW w:type="dxa" w:w="3120"/>
+            <w:shd w:val="clear" w:color="auto" w:fill="D9E2F3"/>
+          </w:tcPr>
+          <w:p>
+            <w:r>
+              <w:rPr>
+                <w:b/>
+              </w:rPr>
+            </w:r>
+            <w:r>
+              <w:rPr>
+                <w:b/>
+                <w:sz w:val="18"/>
+              </w:rPr>
+              <w:t>No</w:t>
+            </w:r>
+          </w:p>
+        </w:tc>
+        <w:tc>
+          <w:tcPr>
+            <w:tcW w:type="dxa" w:w="3120"/>
+            <w:shd w:val="clear" w:color="auto" w:fill="D9E2F3"/>
+          </w:tcPr>
+          <w:p>
+            <w:r>
+              <w:rPr>
+                <w:b/>
+              </w:rPr>
+            </w:r>
+            <w:r>
+              <w:rPr>
+                <w:b/>
+                <w:sz w:val="18"/>
+              </w:rPr>
+              <w:t>Dokumen / Standar</w:t>
+            </w:r>
+          </w:p>
+        </w:tc>
+        <w:tc>
+          <w:tcPr>
+            <w:tcW w:type="dxa" w:w="3120"/>
+            <w:shd w:val="clear" w:color="auto" w:fill="D9E2F3"/>
+          </w:tcPr>
+          <w:p>
+            <w:r>
+              <w:rPr>
+                <w:b/>
+              </w:rPr>
+            </w:r>
+            <w:r>
+              <w:rPr>
+                <w:b/>
+                <w:sz w:val="18"/>
+              </w:rPr>
+              <w:t>Keterangan</w:t>
+            </w:r>
+          </w:p>
+        </w:tc>
+      </w:tr>
+      <w:tr>
+        <w:tc>
+          <w:tcPr>
+            <w:tcW w:type="dxa" w:w="3120"/>
+          </w:tcPr>
+          <w:p>
+            <w:r>
+              <w:rPr>
+                <w:sz w:val="18"/>
+              </w:rPr>
+              <w:t>1</w:t>
+            </w:r>
+          </w:p>
+        </w:tc>
+        <w:tc>
+          <w:tcPr>
+            <w:tcW w:type="dxa" w:w="3120"/>
+          </w:tcPr>
+          <w:p>
+            <w:r>
+              <w:rPr>
+                <w:sz w:val="18"/>
+              </w:rPr>
+              <w:t xml:space="preserve">IEEE 829-2008, </w:t>
+            </w:r>
+            <w:r>
+              <w:rPr>
+                <w:i/>
+                <w:sz w:val="18"/>
+              </w:rPr>
+              <w:t>IEEE Standard for Software and System Test Documentation</w:t>
+            </w:r>
+          </w:p>
+        </w:tc>
+        <w:tc>
+          <w:tcPr>
+            <w:tcW w:type="dxa" w:w="3120"/>
+          </w:tcPr>
+          <w:p>
+            <w:r>
+              <w:rPr>
+                <w:sz w:val="18"/>
+              </w:rPr>
+              <w:t>Standar acuan struktural untuk perencanaan dan pelaporan hasil pengujian perangkat lunak, menjadi dasar format Bab 2–5 dokumen ini.</w:t>
+            </w:r>
+          </w:p>
+        </w:tc>
+      </w:tr>
+      <w:tr>
+        <w:tc>
+          <w:tcPr>
+            <w:tcW w:type="dxa" w:w="3120"/>
+          </w:tcPr>
+          <w:p>
+            <w:r>
+              <w:rPr>
+                <w:sz w:val="18"/>
+              </w:rPr>
+              <w:t>2</w:t>
+            </w:r>
+          </w:p>
+        </w:tc>
+        <w:tc>
+          <w:tcPr>
+            <w:tcW w:type="dxa" w:w="3120"/>
+          </w:tcPr>
+          <w:p>
+            <w:r>
+              <w:rPr>
+                <w:rFonts w:ascii="Consolas" w:hAnsi="Consolas"/>
+                <w:color w:val="C7254E"/>
+                <w:sz w:val="18"/>
+              </w:rPr>
+              <w:t>SKPL.md</w:t>
+            </w:r>
+            <w:r>
+              <w:rPr>
+                <w:sz w:val="18"/>
+              </w:rPr>
+              <w:t xml:space="preserve"> (Spesifikasi Kebutuhan Perangkat Lunak Payana), Bonaventura Octavito, 2026</w:t>
+            </w:r>
+          </w:p>
+        </w:tc>
+        <w:tc>
+          <w:tcPr>
+            <w:tcW w:type="dxa" w:w="3120"/>
+          </w:tcPr>
+          <w:p>
+            <w:r>
+              <w:rPr>
+                <w:sz w:val="18"/>
+              </w:rPr>
+              <w:t>Sumber definitif seluruh Use Case (UC-01 s.d. UC-29) dan Functional Requirement (FR-PAYANA-xxx) yang menjadi acuan traceability KU/AU pada dokumen ini.</w:t>
+            </w:r>
+          </w:p>
+        </w:tc>
+      </w:tr>
+      <w:tr>
+        <w:tc>
+          <w:tcPr>
+            <w:tcW w:type="dxa" w:w="3120"/>
+          </w:tcPr>
+          <w:p>
+            <w:r>
+              <w:rPr>
+                <w:sz w:val="18"/>
+              </w:rPr>
+              <w:t>3</w:t>
+            </w:r>
+          </w:p>
+        </w:tc>
+        <w:tc>
+          <w:tcPr>
+            <w:tcW w:type="dxa" w:w="3120"/>
+          </w:tcPr>
+          <w:p>
+            <w:r>
+              <w:rPr>
+                <w:rFonts w:ascii="Consolas" w:hAnsi="Consolas"/>
+                <w:color w:val="C7254E"/>
+                <w:sz w:val="18"/>
+              </w:rPr>
+              <w:t>DPPL.md</w:t>
+            </w:r>
+            <w:r>
+              <w:rPr>
+                <w:sz w:val="18"/>
+              </w:rPr>
+              <w:t xml:space="preserve"> (Deskripsi Perancangan Perangkat Lunak Payana), Bonaventura Octavito, 2026</w:t>
+            </w:r>
+          </w:p>
+        </w:tc>
+        <w:tc>
+          <w:tcPr>
+            <w:tcW w:type="dxa" w:w="3120"/>
+          </w:tcPr>
+          <w:p>
+            <w:r>
+              <w:rPr>
+                <w:sz w:val="18"/>
+              </w:rPr>
+              <w:t>Sumber rancangan komponen (smart contract, endpoint API, halaman frontend) yang diuji — dirujuk untuk memverifikasi bahwa butir uji menyasar komponen implementasi yang benar.</w:t>
+            </w:r>
+          </w:p>
+        </w:tc>
+      </w:tr>
+      <w:tr>
+        <w:tc>
+          <w:tcPr>
+            <w:tcW w:type="dxa" w:w="3120"/>
+          </w:tcPr>
+          <w:p>
+            <w:r>
+              <w:rPr>
+                <w:sz w:val="18"/>
+              </w:rPr>
+              <w:t>4</w:t>
+            </w:r>
+          </w:p>
+        </w:tc>
+        <w:tc>
+          <w:tcPr>
+            <w:tcW w:type="dxa" w:w="3120"/>
+          </w:tcPr>
+          <w:p>
+            <w:r>
+              <w:rPr>
+                <w:i/>
+                <w:sz w:val="18"/>
+              </w:rPr>
+              <w:t>Foundry Book — Ethereum Development Toolkit</w:t>
+            </w:r>
+            <w:r>
+              <w:rPr>
+                <w:sz w:val="18"/>
+              </w:rPr>
+              <w:t>, Paradigm, 2024. Tersedia: https://book.getfoundry.sh</w:t>
+            </w:r>
+          </w:p>
+        </w:tc>
+        <w:tc>
+          <w:tcPr>
+            <w:tcW w:type="dxa" w:w="3120"/>
+          </w:tcPr>
+          <w:p>
+            <w:r>
+              <w:rPr>
+                <w:sz w:val="18"/>
+              </w:rPr>
+              <w:t xml:space="preserve">Dokumentasi resmi framework </w:t>
+            </w:r>
+            <w:r>
+              <w:rPr>
+                <w:rFonts w:ascii="Consolas" w:hAnsi="Consolas"/>
+                <w:color w:val="C7254E"/>
+                <w:sz w:val="18"/>
+              </w:rPr>
+              <w:t>forge test</w:t>
+            </w:r>
+            <w:r>
+              <w:rPr>
+                <w:sz w:val="18"/>
+              </w:rPr>
+              <w:t xml:space="preserve"> yang dipakai untuk seluruh pengujian Unit (white-box/gray-box) pada lapisan smart contract.</w:t>
+            </w:r>
+          </w:p>
+        </w:tc>
+      </w:tr>
+      <w:tr>
+        <w:tc>
+          <w:tcPr>
+            <w:tcW w:type="dxa" w:w="3120"/>
+          </w:tcPr>
+          <w:p>
+            <w:r>
+              <w:rPr>
+                <w:sz w:val="18"/>
+              </w:rPr>
+              <w:t>5</w:t>
+            </w:r>
+          </w:p>
+        </w:tc>
+        <w:tc>
+          <w:tcPr>
+            <w:tcW w:type="dxa" w:w="3120"/>
+          </w:tcPr>
+          <w:p>
+            <w:r>
+              <w:rPr>
+                <w:sz w:val="18"/>
+              </w:rPr>
+              <w:t>Base Sepolia Network Documentation, Coinbase, 2024. Tersedia: https://docs.base.org</w:t>
+            </w:r>
+          </w:p>
+        </w:tc>
+        <w:tc>
+          <w:tcPr>
+            <w:tcW w:type="dxa" w:w="3120"/>
+          </w:tcPr>
+          <w:p>
+            <w:r>
+              <w:rPr>
+                <w:sz w:val="18"/>
+              </w:rPr>
+              <w:t>Spesifikasi jaringan testnet tempat seluruh pengujian System/Integration dijalankan (Chain ID 84532).</w:t>
+            </w:r>
+          </w:p>
+        </w:tc>
+      </w:tr>
+      <w:tr>
+        <w:tc>
+          <w:tcPr>
+            <w:tcW w:type="dxa" w:w="3120"/>
+          </w:tcPr>
+          <w:p>
+            <w:r>
+              <w:rPr>
+                <w:sz w:val="18"/>
+              </w:rPr>
+              <w:t>6</w:t>
+            </w:r>
+          </w:p>
+        </w:tc>
+        <w:tc>
+          <w:tcPr>
+            <w:tcW w:type="dxa" w:w="3120"/>
+          </w:tcPr>
+          <w:p>
+            <w:r>
+              <w:rPr>
+                <w:sz w:val="18"/>
+              </w:rPr>
+              <w:t xml:space="preserve">EIP-4337: </w:t>
+            </w:r>
+            <w:r>
+              <w:rPr>
+                <w:i/>
+                <w:sz w:val="18"/>
+              </w:rPr>
+              <w:t>Account Abstraction Using Alt Mempool</w:t>
+            </w:r>
+            <w:r>
+              <w:rPr>
+                <w:sz w:val="18"/>
+              </w:rPr>
+              <w:t>, Ethereum Foundation, 2021</w:t>
+            </w:r>
+          </w:p>
+        </w:tc>
+        <w:tc>
+          <w:tcPr>
+            <w:tcW w:type="dxa" w:w="3120"/>
+          </w:tcPr>
+          <w:p>
+            <w:r>
+              <w:rPr>
+                <w:sz w:val="18"/>
+              </w:rPr>
+              <w:t>Standar yang mendasari pengujian alur gasless (Paymaster, UserOperation) pada butir uji klaim gaji dan aksi karyawan lainnya.</w:t>
+            </w:r>
+          </w:p>
+        </w:tc>
+      </w:tr>
+      <w:tr>
+        <w:tc>
+          <w:tcPr>
+            <w:tcW w:type="dxa" w:w="3120"/>
+          </w:tcPr>
+          <w:p>
+            <w:r>
+              <w:rPr>
+                <w:sz w:val="18"/>
+              </w:rPr>
+              <w:t>7</w:t>
+            </w:r>
+          </w:p>
+        </w:tc>
+        <w:tc>
+          <w:tcPr>
+            <w:tcW w:type="dxa" w:w="3120"/>
+          </w:tcPr>
+          <w:p>
+            <w:r>
+              <w:rPr>
+                <w:sz w:val="18"/>
+              </w:rPr>
+              <w:t>k6 Documentation, Grafana Labs, 2024. Tersedia: https://k6.io/docs</w:t>
+            </w:r>
+          </w:p>
+        </w:tc>
+        <w:tc>
+          <w:tcPr>
+            <w:tcW w:type="dxa" w:w="3120"/>
+          </w:tcPr>
+          <w:p>
+            <w:r>
+              <w:rPr>
+                <w:sz w:val="18"/>
+              </w:rPr>
+              <w:t>Tooling yang dipakai pada stress test non-fungsional (</w:t>
+            </w:r>
+            <w:r>
+              <w:rPr>
+                <w:rFonts w:ascii="Consolas" w:hAnsi="Consolas"/>
+                <w:color w:val="C7254E"/>
+                <w:sz w:val="18"/>
+              </w:rPr>
+              <w:t>stress-test/README.md</w:t>
+            </w:r>
+            <w:r>
+              <w:rPr>
+                <w:sz w:val="18"/>
+              </w:rPr>
+              <w:t>), dirujuk pada butir uji yang berkaitan dengan NFR-PAYANA-01/07.</w:t>
+            </w:r>
+          </w:p>
+        </w:tc>
+      </w:tr>
+      <w:tr>
+        <w:tc>
+          <w:tcPr>
+            <w:tcW w:type="dxa" w:w="3120"/>
+          </w:tcPr>
+          <w:p>
+            <w:r>
+              <w:rPr>
+                <w:sz w:val="18"/>
+              </w:rPr>
+              <w:t>8</w:t>
+            </w:r>
+          </w:p>
+        </w:tc>
+        <w:tc>
+          <w:tcPr>
+            <w:tcW w:type="dxa" w:w="3120"/>
+          </w:tcPr>
+          <w:p>
+            <w:r>
+              <w:rPr>
+                <w:sz w:val="18"/>
+              </w:rPr>
+              <w:t>Alchemy Webhooks Documentation, Alchemy, 2024. Tersedia: https://docs.alchemy.com/docs/webhooks</w:t>
+            </w:r>
+          </w:p>
+        </w:tc>
+        <w:tc>
+          <w:tcPr>
+            <w:tcW w:type="dxa" w:w="3120"/>
+          </w:tcPr>
+          <w:p>
+            <w:r>
+              <w:rPr>
+                <w:sz w:val="18"/>
+              </w:rPr>
+              <w:t>Referensi mekanisme webhook HMAC yang diuji pada alur indexing event on-chain ke backend.</w:t>
+            </w:r>
+          </w:p>
+        </w:tc>
+      </w:tr>
+    </w:tbl>
+    <w:p>
+      <w:pPr>
+        <w:spacing w:after="80"/>
+      </w:pPr>
     </w:p>
     <w:p>
       <w:pPr>
         <w:spacing w:after="120"/>
       </w:pPr>
       <w:r>
-        <w:rPr>
-          <w:i/>
-        </w:rPr>
-        <w:t>(diisi manual oleh penulis — dapat merujuk `SKPL.md` §1.3 sebagai bahan dasar, disesuaikan cakupan istilah yang relevan untuk pengujian)</w:t>
-      </w:r>
-    </w:p>
-    <w:p>
-      <w:pPr>
-        <w:pStyle w:val="Heading3"/>
-      </w:pPr>
-      <w:r>
-        <w:t>1.4 Referensi</w:t>
-      </w:r>
-    </w:p>
-    <w:p>
-      <w:pPr>
-        <w:spacing w:after="120"/>
-      </w:pPr>
-      <w:r>
-        <w:rPr>
-          <w:i/>
-        </w:rPr>
-        <w:t>(diisi manual oleh penulis — dapat merujuk `SKPL.md` §1.4 dan `DPPL.md` §1.4 sebagai bahan dasar, ditambah referensi khusus pengujian seperti dokumentasi Foundry/Forge)</w:t>
+        <w:t xml:space="preserve">Referensi tambahan yang bersifat regulasi/hukum (UU Cipta Kerja, UU PDP, PMK 168/2023, dll.) yang mendasari kriteria penerimaan pada butir uji terkait pajak dan pesangon mengikuti daftar lengkap di </w:t>
+      </w:r>
+      <w:r>
+        <w:rPr>
+          <w:rFonts w:ascii="Consolas" w:hAnsi="Consolas"/>
+          <w:color w:val="C7254E"/>
+          <w:sz w:val="18"/>
+        </w:rPr>
+        <w:t>SKPL.md</w:t>
+      </w:r>
+      <w:r>
+        <w:t xml:space="preserve"> §1.4 — tidak diduplikasi di sini.</w:t>
       </w:r>
     </w:p>
     <w:p>
@@ -11700,6 +13735,485 @@
           </w:p>
         </w:tc>
       </w:tr>
+      <w:tr>
+        <w:tc>
+          <w:tcPr>
+            <w:tcW w:type="dxa" w:w="1337"/>
+          </w:tcPr>
+          <w:p>
+            <w:r>
+              <w:rPr>
+                <w:sz w:val="18"/>
+              </w:rPr>
+              <w:t>KU-30 Performa di Bawah Beban</w:t>
+            </w:r>
+          </w:p>
+        </w:tc>
+        <w:tc>
+          <w:tcPr>
+            <w:tcW w:type="dxa" w:w="1337"/>
+          </w:tcPr>
+          <w:p>
+            <w:r>
+              <w:rPr>
+                <w:sz w:val="18"/>
+              </w:rPr>
+              <w:t>Latency 3 endpoint inti pada 50→100 concurrent users, ramping ~2 menit (Run 1)</w:t>
+            </w:r>
+          </w:p>
+        </w:tc>
+        <w:tc>
+          <w:tcPr>
+            <w:tcW w:type="dxa" w:w="1337"/>
+          </w:tcPr>
+          <w:p>
+            <w:r>
+              <w:rPr>
+                <w:sz w:val="18"/>
+              </w:rPr>
+              <w:t>—</w:t>
+            </w:r>
+          </w:p>
+        </w:tc>
+        <w:tc>
+          <w:tcPr>
+            <w:tcW w:type="dxa" w:w="1337"/>
+          </w:tcPr>
+          <w:p>
+            <w:r>
+              <w:rPr>
+                <w:sz w:val="18"/>
+              </w:rPr>
+              <w:t>NFR-01</w:t>
+            </w:r>
+          </w:p>
+        </w:tc>
+        <w:tc>
+          <w:tcPr>
+            <w:tcW w:type="dxa" w:w="1337"/>
+          </w:tcPr>
+          <w:p>
+            <w:r>
+              <w:rPr>
+                <w:sz w:val="18"/>
+              </w:rPr>
+              <w:t>AU-30-01</w:t>
+            </w:r>
+          </w:p>
+        </w:tc>
+        <w:tc>
+          <w:tcPr>
+            <w:tcW w:type="dxa" w:w="1337"/>
+          </w:tcPr>
+          <w:p>
+            <w:r>
+              <w:rPr>
+                <w:sz w:val="18"/>
+              </w:rPr>
+              <w:t>System (k6 load test)</w:t>
+            </w:r>
+          </w:p>
+        </w:tc>
+        <w:tc>
+          <w:tcPr>
+            <w:tcW w:type="dxa" w:w="1337"/>
+          </w:tcPr>
+          <w:p>
+            <w:r>
+              <w:rPr>
+                <w:sz w:val="18"/>
+              </w:rPr>
+              <w:t>Non-Functional — Performance</w:t>
+            </w:r>
+          </w:p>
+        </w:tc>
+      </w:tr>
+      <w:tr>
+        <w:tc>
+          <w:tcPr>
+            <w:tcW w:type="dxa" w:w="1337"/>
+          </w:tcPr>
+          <w:p>
+            <w:r>
+              <w:rPr>
+                <w:sz w:val="18"/>
+              </w:rPr>
+              <w:t>KU-30 Performa di Bawah Beban</w:t>
+            </w:r>
+          </w:p>
+        </w:tc>
+        <w:tc>
+          <w:tcPr>
+            <w:tcW w:type="dxa" w:w="1337"/>
+          </w:tcPr>
+          <w:p>
+            <w:r>
+              <w:rPr>
+                <w:sz w:val="18"/>
+              </w:rPr>
+              <w:t>Latency 19 endpoint (hampir seluruh permukaan API publik), 0 error 5xx (Run 2)</w:t>
+            </w:r>
+          </w:p>
+        </w:tc>
+        <w:tc>
+          <w:tcPr>
+            <w:tcW w:type="dxa" w:w="1337"/>
+          </w:tcPr>
+          <w:p>
+            <w:r>
+              <w:rPr>
+                <w:sz w:val="18"/>
+              </w:rPr>
+              <w:t>—</w:t>
+            </w:r>
+          </w:p>
+        </w:tc>
+        <w:tc>
+          <w:tcPr>
+            <w:tcW w:type="dxa" w:w="1337"/>
+          </w:tcPr>
+          <w:p>
+            <w:r>
+              <w:rPr>
+                <w:sz w:val="18"/>
+              </w:rPr>
+              <w:t>NFR-01</w:t>
+            </w:r>
+          </w:p>
+        </w:tc>
+        <w:tc>
+          <w:tcPr>
+            <w:tcW w:type="dxa" w:w="1337"/>
+          </w:tcPr>
+          <w:p>
+            <w:r>
+              <w:rPr>
+                <w:sz w:val="18"/>
+              </w:rPr>
+              <w:t>AU-30-02</w:t>
+            </w:r>
+          </w:p>
+        </w:tc>
+        <w:tc>
+          <w:tcPr>
+            <w:tcW w:type="dxa" w:w="1337"/>
+          </w:tcPr>
+          <w:p>
+            <w:r>
+              <w:rPr>
+                <w:sz w:val="18"/>
+              </w:rPr>
+              <w:t>System (k6 load test)</w:t>
+            </w:r>
+          </w:p>
+        </w:tc>
+        <w:tc>
+          <w:tcPr>
+            <w:tcW w:type="dxa" w:w="1337"/>
+          </w:tcPr>
+          <w:p>
+            <w:r>
+              <w:rPr>
+                <w:sz w:val="18"/>
+              </w:rPr>
+              <w:t>Non-Functional — Performance</w:t>
+            </w:r>
+          </w:p>
+        </w:tc>
+      </w:tr>
+      <w:tr>
+        <w:tc>
+          <w:tcPr>
+            <w:tcW w:type="dxa" w:w="1337"/>
+          </w:tcPr>
+          <w:p>
+            <w:r>
+              <w:rPr>
+                <w:sz w:val="18"/>
+              </w:rPr>
+              <w:t>KU-30 Performa di Bawah Beban</w:t>
+            </w:r>
+          </w:p>
+        </w:tc>
+        <w:tc>
+          <w:tcPr>
+            <w:tcW w:type="dxa" w:w="1337"/>
+          </w:tcPr>
+          <w:p>
+            <w:r>
+              <w:rPr>
+                <w:sz w:val="18"/>
+              </w:rPr>
+              <w:t>Soak test 40 concurrent sustained 14 menit — cek degradasi bertahap/connection pool exhaustion (Run 3)</w:t>
+            </w:r>
+          </w:p>
+        </w:tc>
+        <w:tc>
+          <w:tcPr>
+            <w:tcW w:type="dxa" w:w="1337"/>
+          </w:tcPr>
+          <w:p>
+            <w:r>
+              <w:rPr>
+                <w:sz w:val="18"/>
+              </w:rPr>
+              <w:t>—</w:t>
+            </w:r>
+          </w:p>
+        </w:tc>
+        <w:tc>
+          <w:tcPr>
+            <w:tcW w:type="dxa" w:w="1337"/>
+          </w:tcPr>
+          <w:p>
+            <w:r>
+              <w:rPr>
+                <w:sz w:val="18"/>
+              </w:rPr>
+              <w:t>NFR-01,06</w:t>
+            </w:r>
+          </w:p>
+        </w:tc>
+        <w:tc>
+          <w:tcPr>
+            <w:tcW w:type="dxa" w:w="1337"/>
+          </w:tcPr>
+          <w:p>
+            <w:r>
+              <w:rPr>
+                <w:sz w:val="18"/>
+              </w:rPr>
+              <w:t>AU-30-03</w:t>
+            </w:r>
+          </w:p>
+        </w:tc>
+        <w:tc>
+          <w:tcPr>
+            <w:tcW w:type="dxa" w:w="1337"/>
+          </w:tcPr>
+          <w:p>
+            <w:r>
+              <w:rPr>
+                <w:sz w:val="18"/>
+              </w:rPr>
+              <w:t>System (k6 soak test)</w:t>
+            </w:r>
+          </w:p>
+        </w:tc>
+        <w:tc>
+          <w:tcPr>
+            <w:tcW w:type="dxa" w:w="1337"/>
+          </w:tcPr>
+          <w:p>
+            <w:r>
+              <w:rPr>
+                <w:sz w:val="18"/>
+              </w:rPr>
+              <w:t>Non-Functional — Performance/Reliability</w:t>
+            </w:r>
+          </w:p>
+        </w:tc>
+      </w:tr>
+      <w:tr>
+        <w:tc>
+          <w:tcPr>
+            <w:tcW w:type="dxa" w:w="1337"/>
+          </w:tcPr>
+          <w:p>
+            <w:r>
+              <w:rPr>
+                <w:sz w:val="18"/>
+              </w:rPr>
+              <w:t>KU-31 Ketahanan RPC &amp; Lonjakan Beban</w:t>
+            </w:r>
+          </w:p>
+        </w:tc>
+        <w:tc>
+          <w:tcPr>
+            <w:tcW w:type="dxa" w:w="1337"/>
+          </w:tcPr>
+          <w:p>
+            <w:r>
+              <w:rPr>
+                <w:sz w:val="18"/>
+              </w:rPr>
+              <w:t>Spike test instan 0→100 VU dalam 5 detik, tahan 60 detik — cek pemulihan bersih (Run 4)</w:t>
+            </w:r>
+          </w:p>
+        </w:tc>
+        <w:tc>
+          <w:tcPr>
+            <w:tcW w:type="dxa" w:w="1337"/>
+          </w:tcPr>
+          <w:p>
+            <w:r>
+              <w:rPr>
+                <w:sz w:val="18"/>
+              </w:rPr>
+              <w:t>—</w:t>
+            </w:r>
+          </w:p>
+        </w:tc>
+        <w:tc>
+          <w:tcPr>
+            <w:tcW w:type="dxa" w:w="1337"/>
+          </w:tcPr>
+          <w:p>
+            <w:r>
+              <w:rPr>
+                <w:sz w:val="18"/>
+              </w:rPr>
+              <w:t>NFR-07</w:t>
+            </w:r>
+          </w:p>
+        </w:tc>
+        <w:tc>
+          <w:tcPr>
+            <w:tcW w:type="dxa" w:w="1337"/>
+          </w:tcPr>
+          <w:p>
+            <w:r>
+              <w:rPr>
+                <w:sz w:val="18"/>
+              </w:rPr>
+              <w:t>AU-31-01</w:t>
+            </w:r>
+          </w:p>
+        </w:tc>
+        <w:tc>
+          <w:tcPr>
+            <w:tcW w:type="dxa" w:w="1337"/>
+          </w:tcPr>
+          <w:p>
+            <w:r>
+              <w:rPr>
+                <w:sz w:val="18"/>
+              </w:rPr>
+              <w:t>System (k6 spike test)</w:t>
+            </w:r>
+          </w:p>
+        </w:tc>
+        <w:tc>
+          <w:tcPr>
+            <w:tcW w:type="dxa" w:w="1337"/>
+          </w:tcPr>
+          <w:p>
+            <w:r>
+              <w:rPr>
+                <w:sz w:val="18"/>
+              </w:rPr>
+              <w:t>Non-Functional — Reliability</w:t>
+            </w:r>
+          </w:p>
+        </w:tc>
+      </w:tr>
+      <w:tr>
+        <w:tc>
+          <w:tcPr>
+            <w:tcW w:type="dxa" w:w="1337"/>
+          </w:tcPr>
+          <w:p>
+            <w:r>
+              <w:rPr>
+                <w:sz w:val="18"/>
+              </w:rPr>
+              <w:t>KU-31 Ketahanan RPC &amp; Lonjakan Beban</w:t>
+            </w:r>
+          </w:p>
+        </w:tc>
+        <w:tc>
+          <w:tcPr>
+            <w:tcW w:type="dxa" w:w="1337"/>
+          </w:tcPr>
+          <w:p>
+            <w:r>
+              <w:rPr>
+                <w:sz w:val="18"/>
+              </w:rPr>
+              <w:t xml:space="preserve">Probe ceiling </w:t>
+            </w:r>
+            <w:r>
+              <w:rPr>
+                <w:rFonts w:ascii="Consolas" w:hAnsi="Consolas"/>
+                <w:color w:val="C7254E"/>
+                <w:sz w:val="18"/>
+              </w:rPr>
+              <w:t>eth_call</w:t>
+            </w:r>
+            <w:r>
+              <w:rPr>
+                <w:sz w:val="18"/>
+              </w:rPr>
+              <w:t xml:space="preserve"> bersamaan RPC Alchemy free-tier, validasi retry+backoff+fallback</w:t>
+            </w:r>
+          </w:p>
+        </w:tc>
+        <w:tc>
+          <w:tcPr>
+            <w:tcW w:type="dxa" w:w="1337"/>
+          </w:tcPr>
+          <w:p>
+            <w:r>
+              <w:rPr>
+                <w:sz w:val="18"/>
+              </w:rPr>
+              <w:t>—</w:t>
+            </w:r>
+          </w:p>
+        </w:tc>
+        <w:tc>
+          <w:tcPr>
+            <w:tcW w:type="dxa" w:w="1337"/>
+          </w:tcPr>
+          <w:p>
+            <w:r>
+              <w:rPr>
+                <w:sz w:val="18"/>
+              </w:rPr>
+              <w:t>NFR-07</w:t>
+            </w:r>
+          </w:p>
+        </w:tc>
+        <w:tc>
+          <w:tcPr>
+            <w:tcW w:type="dxa" w:w="1337"/>
+          </w:tcPr>
+          <w:p>
+            <w:r>
+              <w:rPr>
+                <w:sz w:val="18"/>
+              </w:rPr>
+              <w:t>AU-31-02</w:t>
+            </w:r>
+          </w:p>
+        </w:tc>
+        <w:tc>
+          <w:tcPr>
+            <w:tcW w:type="dxa" w:w="1337"/>
+          </w:tcPr>
+          <w:p>
+            <w:r>
+              <w:rPr>
+                <w:sz w:val="18"/>
+              </w:rPr>
+              <w:t>System (k6 RPC probe)</w:t>
+            </w:r>
+          </w:p>
+        </w:tc>
+        <w:tc>
+          <w:tcPr>
+            <w:tcW w:type="dxa" w:w="1337"/>
+          </w:tcPr>
+          <w:p>
+            <w:r>
+              <w:rPr>
+                <w:sz w:val="18"/>
+              </w:rPr>
+              <w:t>Non-Functional — Reliability</w:t>
+            </w:r>
+          </w:p>
+        </w:tc>
+      </w:tr>
     </w:tbl>
     <w:p>
       <w:pPr>
@@ -12009,6 +14523,50 @@
     </w:p>
     <w:p>
       <w:pPr>
+        <w:pStyle w:val="ListNumber"/>
+      </w:pPr>
+      <w:r>
+        <w:rPr>
+          <w:b/>
+        </w:rPr>
+        <w:t>Non-fungsional — performa dan ketahanan (KU-30, KU-31):</w:t>
+      </w:r>
+      <w:r>
+        <w:t xml:space="preserve"> dijalankan terakhir dan</w:t>
+      </w:r>
+    </w:p>
+    <w:p>
+      <w:pPr>
+        <w:spacing w:after="120"/>
+      </w:pPr>
+      <w:r>
+        <w:t xml:space="preserve">independen dari urutan 1–9 di atas — k6 memukul endpoint yang sudah harus berfungsi benar secara fungsional terlebih dahulu (kalau logika bisnisnya salah, angka latency tidak bermakna apa-apa). Dijalankan di lingkungan terpisah dari sesi pengujian fungsional harian (lihat </w:t>
+      </w:r>
+      <w:r>
+        <w:rPr>
+          <w:rFonts w:ascii="Consolas" w:hAnsi="Consolas"/>
+          <w:color w:val="C7254E"/>
+          <w:sz w:val="18"/>
+        </w:rPr>
+        <w:t>stress-test/README.md</w:t>
+      </w:r>
+      <w:r>
+        <w:t xml:space="preserve">) karena butuh setup Docker (InfluxDB + Grafana) tersendiri dan sengaja tidak menyentuh </w:t>
+      </w:r>
+      <w:r>
+        <w:rPr>
+          <w:rFonts w:ascii="Consolas" w:hAnsi="Consolas"/>
+          <w:color w:val="C7254E"/>
+          <w:sz w:val="18"/>
+        </w:rPr>
+        <w:t>/bundler/relay</w:t>
+      </w:r>
+      <w:r>
+        <w:t xml:space="preserve"> (lihat Bab 6 untuk alasannya).</w:t>
+      </w:r>
+    </w:p>
+    <w:p>
+      <w:pPr>
         <w:pStyle w:val="Heading4"/>
       </w:pPr>
       <w:r>
@@ -19473,6 +22031,390 @@
       </w:r>
       <w:r>
         <w:t>.</w:t>
+      </w:r>
+    </w:p>
+    <w:p>
+      <w:r>
+        <w:br w:type="page"/>
+      </w:r>
+    </w:p>
+    <w:p>
+      <w:pPr>
+        <w:pStyle w:val="Heading3"/>
+      </w:pPr>
+      <w:r>
+        <w:t>KU-30 — Performa di Bawah Beban (NFR-PAYANA-01)</w:t>
+      </w:r>
+    </w:p>
+    <w:p>
+      <w:pPr>
+        <w:spacing w:after="120"/>
+      </w:pPr>
+      <w:r>
+        <w:rPr>
+          <w:b/>
+        </w:rPr>
+        <w:t>Antarmuka:</w:t>
+      </w:r>
+      <w:r>
+        <w:t xml:space="preserve"> k6 load generator memukul endpoint REST publik/terautentikasi langsung; hasil diagregasi via InfluxDB + dashboard Grafana. Skrip: </w:t>
+      </w:r>
+      <w:r>
+        <w:rPr>
+          <w:rFonts w:ascii="Consolas" w:hAnsi="Consolas"/>
+          <w:color w:val="C7254E"/>
+          <w:sz w:val="18"/>
+        </w:rPr>
+        <w:t>stress-test/k6/load-test.js</w:t>
+      </w:r>
+      <w:r>
+        <w:t xml:space="preserve"> (AU-30-01), </w:t>
+      </w:r>
+      <w:r>
+        <w:rPr>
+          <w:rFonts w:ascii="Consolas" w:hAnsi="Consolas"/>
+          <w:color w:val="C7254E"/>
+          <w:sz w:val="18"/>
+        </w:rPr>
+        <w:t>load-test-full.js</w:t>
+      </w:r>
+      <w:r>
+        <w:t xml:space="preserve"> (AU-30-02), </w:t>
+      </w:r>
+      <w:r>
+        <w:rPr>
+          <w:rFonts w:ascii="Consolas" w:hAnsi="Consolas"/>
+          <w:color w:val="C7254E"/>
+          <w:sz w:val="18"/>
+        </w:rPr>
+        <w:t>soak-test.js</w:t>
+      </w:r>
+      <w:r>
+        <w:t xml:space="preserve"> (AU-30-03). Detail lengkap ada di </w:t>
+      </w:r>
+      <w:r>
+        <w:rPr>
+          <w:rFonts w:ascii="Consolas" w:hAnsi="Consolas"/>
+          <w:color w:val="C7254E"/>
+          <w:sz w:val="18"/>
+        </w:rPr>
+        <w:t>stress-test/README.md</w:t>
+      </w:r>
+      <w:r>
+        <w:t>.</w:t>
+      </w:r>
+    </w:p>
+    <w:p>
+      <w:pPr>
+        <w:pStyle w:val="ListBullet"/>
+        <w:ind w:left="360"/>
+      </w:pPr>
+      <w:r>
+        <w:rPr>
+          <w:b/>
+        </w:rPr>
+        <w:t>AU-30-01</w:t>
+      </w:r>
+      <w:r>
+        <w:t xml:space="preserve"> — Input: </w:t>
+      </w:r>
+      <w:r>
+        <w:rPr>
+          <w:rFonts w:ascii="Consolas" w:hAnsi="Consolas"/>
+          <w:color w:val="C7254E"/>
+          <w:sz w:val="18"/>
+        </w:rPr>
+        <w:t>load-test.js</w:t>
+      </w:r>
+      <w:r>
+        <w:t>, 3 endpoint inti (</w:t>
+      </w:r>
+      <w:r>
+        <w:rPr>
+          <w:rFonts w:ascii="Consolas" w:hAnsi="Consolas"/>
+          <w:color w:val="C7254E"/>
+          <w:sz w:val="18"/>
+        </w:rPr>
+        <w:t>GET /companies</w:t>
+      </w:r>
+      <w:r>
+        <w:t xml:space="preserve">, </w:t>
+      </w:r>
+      <w:r>
+        <w:rPr>
+          <w:rFonts w:ascii="Consolas" w:hAnsi="Consolas"/>
+          <w:color w:val="C7254E"/>
+          <w:sz w:val="18"/>
+        </w:rPr>
+        <w:t>POST /auth/login</w:t>
+      </w:r>
+      <w:r>
+        <w:t xml:space="preserve">, </w:t>
+      </w:r>
+      <w:r>
+        <w:rPr>
+          <w:rFonts w:ascii="Consolas" w:hAnsi="Consolas"/>
+          <w:color w:val="C7254E"/>
+          <w:sz w:val="18"/>
+        </w:rPr>
+        <w:t>GET /compliance/summary/:hr</w:t>
+      </w:r>
+      <w:r>
+        <w:t>), 50→100 concurrent users ramping ~2 menit. Harapan (target NFR-PAYANA-01 awal): P99 ≤ 500ms di seluruh endpoint.</w:t>
+      </w:r>
+    </w:p>
+    <w:p>
+      <w:pPr>
+        <w:pStyle w:val="ListBullet"/>
+        <w:ind w:left="360"/>
+      </w:pPr>
+      <w:r>
+        <w:rPr>
+          <w:b/>
+        </w:rPr>
+        <w:t>AU-30-02</w:t>
+      </w:r>
+      <w:r>
+        <w:t xml:space="preserve"> — Input: </w:t>
+      </w:r>
+      <w:r>
+        <w:rPr>
+          <w:rFonts w:ascii="Consolas" w:hAnsi="Consolas"/>
+          <w:color w:val="C7254E"/>
+          <w:sz w:val="18"/>
+        </w:rPr>
+        <w:t>load-test-full.js</w:t>
+      </w:r>
+      <w:r>
+        <w:t>, 19 endpoint (hampir seluruh permukaan REST publik/terautentikasi), beban sama seperti AU-30-01. Harapan: 0 error 5xx di endpoint manapun (error rate mentah k6 boleh tinggi kalau semuanya respons bisnis yang benar seperti 403/404/409 — lihat kriteria evaluasi).</w:t>
+      </w:r>
+    </w:p>
+    <w:p>
+      <w:pPr>
+        <w:pStyle w:val="ListBullet"/>
+        <w:ind w:left="360"/>
+      </w:pPr>
+      <w:r>
+        <w:rPr>
+          <w:b/>
+        </w:rPr>
+        <w:t>AU-30-03</w:t>
+      </w:r>
+      <w:r>
+        <w:t xml:space="preserve"> — Input: </w:t>
+      </w:r>
+      <w:r>
+        <w:rPr>
+          <w:rFonts w:ascii="Consolas" w:hAnsi="Consolas"/>
+          <w:color w:val="C7254E"/>
+          <w:sz w:val="18"/>
+        </w:rPr>
+        <w:t>soak-test.js</w:t>
+      </w:r>
+      <w:r>
+        <w:t xml:space="preserve">, 40 concurrent users sustained 14 menit (40 detik ramp-up + 13 menit sustain + 20 detik rampdown), endpoint read-only. Harapan: tidak ada tren kenaikan latency dari menit ke-1 ke menit terakhir (indikasi </w:t>
+      </w:r>
+      <w:r>
+        <w:rPr>
+          <w:i/>
+        </w:rPr>
+        <w:t>tidak</w:t>
+      </w:r>
+      <w:r>
+        <w:t xml:space="preserve"> ada connection pool exhaustion/memory leak), 0 respons 5xx sepanjang durasi.</w:t>
+      </w:r>
+    </w:p>
+    <w:p>
+      <w:pPr>
+        <w:pStyle w:val="Heading3"/>
+      </w:pPr>
+      <w:r>
+        <w:t>KU-31 — Ketahanan RPC &amp; Lonjakan Beban (NFR-PAYANA-07)</w:t>
+      </w:r>
+    </w:p>
+    <w:p>
+      <w:pPr>
+        <w:spacing w:after="120"/>
+      </w:pPr>
+      <w:r>
+        <w:rPr>
+          <w:b/>
+        </w:rPr>
+        <w:t>Antarmuka:</w:t>
+      </w:r>
+      <w:r>
+        <w:t xml:space="preserve"> k6 spike test + skrip probe RPC langsung ke Alchemy. Skrip: </w:t>
+      </w:r>
+      <w:r>
+        <w:rPr>
+          <w:rFonts w:ascii="Consolas" w:hAnsi="Consolas"/>
+          <w:color w:val="C7254E"/>
+          <w:sz w:val="18"/>
+        </w:rPr>
+        <w:t>stress-test/k6/spike-test.js</w:t>
+      </w:r>
+      <w:r>
+        <w:t xml:space="preserve"> (AU-31-01), </w:t>
+      </w:r>
+      <w:r>
+        <w:rPr>
+          <w:rFonts w:ascii="Consolas" w:hAnsi="Consolas"/>
+          <w:color w:val="C7254E"/>
+          <w:sz w:val="18"/>
+        </w:rPr>
+        <w:t>stress-test/k6/rpc-capacity.js</w:t>
+      </w:r>
+      <w:r>
+        <w:t xml:space="preserve"> (AU-31-02).</w:t>
+      </w:r>
+    </w:p>
+    <w:p>
+      <w:pPr>
+        <w:pStyle w:val="ListBullet"/>
+        <w:ind w:left="360"/>
+      </w:pPr>
+      <w:r>
+        <w:rPr>
+          <w:b/>
+        </w:rPr>
+        <w:t>AU-31-01</w:t>
+      </w:r>
+      <w:r>
+        <w:t xml:space="preserve"> — Input: </w:t>
+      </w:r>
+      <w:r>
+        <w:rPr>
+          <w:rFonts w:ascii="Consolas" w:hAnsi="Consolas"/>
+          <w:color w:val="C7254E"/>
+          <w:sz w:val="18"/>
+        </w:rPr>
+        <w:t>spike-test.js</w:t>
+      </w:r>
+      <w:r>
+        <w:t xml:space="preserve">, lonjakan instan 0→100 VU dalam 5 detik, tahan 60 detik di puncak, lalu drop 10 detik. Harapan: sistem pulih bersih pasca-lonjakan (tidak ada request menggantung/timeout setelah drop), 0 respons 5xx, </w:t>
+      </w:r>
+      <w:r>
+        <w:rPr>
+          <w:rFonts w:ascii="Consolas" w:hAnsi="Consolas"/>
+          <w:color w:val="C7254E"/>
+          <w:sz w:val="18"/>
+        </w:rPr>
+        <w:t>POST /auth/login</w:t>
+      </w:r>
+      <w:r>
+        <w:t xml:space="preserve"> tetap 100% sukses meski 100 VU login bersamaan dalam 5 detik (tidak ada </w:t>
+      </w:r>
+      <w:r>
+        <w:rPr>
+          <w:i/>
+        </w:rPr>
+        <w:t>thundering-herd failure</w:t>
+      </w:r>
+      <w:r>
+        <w:t>).</w:t>
+      </w:r>
+    </w:p>
+    <w:p>
+      <w:pPr>
+        <w:pStyle w:val="ListBullet"/>
+        <w:ind w:left="360"/>
+      </w:pPr>
+      <w:r>
+        <w:rPr>
+          <w:b/>
+        </w:rPr>
+        <w:t>AU-31-02</w:t>
+      </w:r>
+      <w:r>
+        <w:t xml:space="preserve"> — Input: </w:t>
+      </w:r>
+      <w:r>
+        <w:rPr>
+          <w:rFonts w:ascii="Consolas" w:hAnsi="Consolas"/>
+          <w:color w:val="C7254E"/>
+          <w:sz w:val="18"/>
+        </w:rPr>
+        <w:t>rpc-capacity.js</w:t>
+      </w:r>
+      <w:r>
+        <w:t xml:space="preserve"> memukul </w:t>
+      </w:r>
+      <w:r>
+        <w:rPr>
+          <w:rFonts w:ascii="Consolas" w:hAnsi="Consolas"/>
+          <w:color w:val="C7254E"/>
+          <w:sz w:val="18"/>
+        </w:rPr>
+        <w:t>PayrollFactory.companyVaults(address)</w:t>
+      </w:r>
+      <w:r>
+        <w:t xml:space="preserve"> (call yang sama persis dengan </w:t>
+      </w:r>
+      <w:r>
+        <w:rPr>
+          <w:rFonts w:ascii="Consolas" w:hAnsi="Consolas"/>
+          <w:color w:val="C7254E"/>
+          <w:sz w:val="18"/>
+        </w:rPr>
+        <w:t>isHr()</w:t>
+      </w:r>
+      <w:r>
+        <w:t>/</w:t>
+      </w:r>
+      <w:r>
+        <w:rPr>
+          <w:rFonts w:ascii="Consolas" w:hAnsi="Consolas"/>
+          <w:color w:val="C7254E"/>
+          <w:sz w:val="18"/>
+        </w:rPr>
+        <w:t>canViewEmployeeData()</w:t>
+      </w:r>
+      <w:r>
+        <w:t xml:space="preserve"> di </w:t>
+      </w:r>
+      <w:r>
+        <w:rPr>
+          <w:rFonts w:ascii="Consolas" w:hAnsi="Consolas"/>
+          <w:color w:val="C7254E"/>
+          <w:sz w:val="18"/>
+        </w:rPr>
+        <w:t>backend/src/services/authz.ts</w:t>
+      </w:r>
+      <w:r>
+        <w:t xml:space="preserve">) dengan concurrency menanjak bertahap sampai RPC Alchemy free-tier mengembalikan </w:t>
+      </w:r>
+      <w:r>
+        <w:rPr>
+          <w:rFonts w:ascii="Consolas" w:hAnsi="Consolas"/>
+          <w:color w:val="C7254E"/>
+          <w:sz w:val="18"/>
+        </w:rPr>
+        <w:t>429</w:t>
+      </w:r>
+      <w:r>
+        <w:t>. Harapan: ceiling concurrency ditemukan secara terukur (bukan diasumsikan), dan hasil probe ini memvalidasi kebutuhan nyata mekanisme retry+backoff+fallback (</w:t>
+      </w:r>
+      <w:r>
+        <w:rPr>
+          <w:rFonts w:ascii="Consolas" w:hAnsi="Consolas"/>
+          <w:color w:val="C7254E"/>
+          <w:sz w:val="18"/>
+        </w:rPr>
+        <w:t>backend/src/services/rpcRetry.ts</w:t>
+      </w:r>
+      <w:r>
+        <w:t xml:space="preserve">) — bukan fitur teoretis, karena </w:t>
+      </w:r>
+      <w:r>
+        <w:rPr>
+          <w:rFonts w:ascii="Consolas" w:hAnsi="Consolas"/>
+          <w:color w:val="C7254E"/>
+          <w:sz w:val="18"/>
+        </w:rPr>
+        <w:t>429</w:t>
+      </w:r>
+      <w:r>
+        <w:t xml:space="preserve"> benar-benar terjadi di atas ambang tersebut.</w:t>
       </w:r>
     </w:p>
     <w:p>
@@ -32703,6 +35645,1544 @@
       <w:pPr>
         <w:spacing w:after="80"/>
       </w:pPr>
+    </w:p>
+    <w:p>
+      <w:r>
+        <w:br w:type="page"/>
+      </w:r>
+    </w:p>
+    <w:p>
+      <w:pPr>
+        <w:pStyle w:val="Heading2"/>
+      </w:pPr>
+      <w:r>
+        <w:t>BAB 6 — HASIL PENGUJIAN NON-FUNGSIONAL (PERFORMA &amp; KETAHANAN)</w:t>
+      </w:r>
+    </w:p>
+    <w:p>
+      <w:pPr>
+        <w:spacing w:after="160"/>
+        <w:ind w:left="576"/>
+      </w:pPr>
+      <w:r>
+        <w:rPr>
+          <w:b/>
+          <w:i/>
+          <w:color w:val="555555"/>
+        </w:rPr>
+        <w:t>5 dari 5</w:t>
+      </w:r>
+      <w:r>
+        <w:rPr>
+          <w:i/>
+          <w:color w:val="555555"/>
+        </w:rPr>
+        <w:t xml:space="preserve"> butir uji non-fungsional sudah dieksekusi nyata (k6 terhadap Base Sepolia + backend lokal, hasil diagregasi InfluxDB, divisualisasi Grafana) dan berstatus </w:t>
+      </w:r>
+      <w:r>
+        <w:rPr>
+          <w:b/>
+          <w:i/>
+          <w:color w:val="555555"/>
+        </w:rPr>
+        <w:t>Handal</w:t>
+      </w:r>
+      <w:r>
+        <w:rPr>
+          <w:i/>
+          <w:color w:val="555555"/>
+        </w:rPr>
+        <w:t xml:space="preserve"> — "Handal" di sini berarti </w:t>
+      </w:r>
+      <w:r>
+        <w:rPr>
+          <w:i/>
+          <w:color w:val="555555"/>
+        </w:rPr>
+        <w:t>tereksekusi dan hasilnya terukur serta dipahami</w:t>
+      </w:r>
+      <w:r>
+        <w:rPr>
+          <w:i/>
+          <w:color w:val="555555"/>
+        </w:rPr>
+        <w:t xml:space="preserve">, BUKAN berarti seluruh threshold P99 awal tercapai (lihat AU-30-01, yang secara eksplisit gagal memenuhi threshold 500ms pada 2 dari 3 endpoint — ini dilaporkan apa adanya, bukan disembunyikan, dan menjadi dasar revisi NFR-PAYANA-01 di </w:t>
+      </w:r>
+      <w:r>
+        <w:rPr>
+          <w:rFonts w:ascii="Consolas" w:hAnsi="Consolas"/>
+          <w:i/>
+          <w:color w:val="555555"/>
+          <w:sz w:val="18"/>
+        </w:rPr>
+        <w:t>SKPL.md</w:t>
+      </w:r>
+      <w:r>
+        <w:rPr>
+          <w:i/>
+          <w:color w:val="555555"/>
+        </w:rPr>
+        <w:t xml:space="preserve">). Detail run lengkap: </w:t>
+      </w:r>
+      <w:r>
+        <w:rPr>
+          <w:rFonts w:ascii="Consolas" w:hAnsi="Consolas"/>
+          <w:i/>
+          <w:color w:val="555555"/>
+          <w:sz w:val="18"/>
+        </w:rPr>
+        <w:t>stress-test/README.md</w:t>
+      </w:r>
+      <w:r>
+        <w:rPr>
+          <w:i/>
+          <w:color w:val="555555"/>
+        </w:rPr>
+        <w:t xml:space="preserve">. Data uji tanggal 2026-06-25.  </w:t>
+      </w:r>
+      <w:r>
+        <w:rPr>
+          <w:b/>
+          <w:i/>
+          <w:color w:val="555555"/>
+        </w:rPr>
+        <w:t>Sengaja tidak diuji beban:</w:t>
+      </w:r>
+      <w:r>
+        <w:rPr>
+          <w:i/>
+          <w:color w:val="555555"/>
+        </w:rPr>
+        <w:t xml:space="preserve"> </w:t>
+      </w:r>
+      <w:r>
+        <w:rPr>
+          <w:rFonts w:ascii="Consolas" w:hAnsi="Consolas"/>
+          <w:i/>
+          <w:color w:val="555555"/>
+          <w:sz w:val="18"/>
+        </w:rPr>
+        <w:t>POST /bundler/relay</w:t>
+      </w:r>
+      <w:r>
+        <w:rPr>
+          <w:i/>
+          <w:color w:val="555555"/>
+        </w:rPr>
+        <w:t>. Endpoint ini meneruskan UserOperation ERC-4337 yang sudah ditandatangani ke Pimlico Bundler dan benar-benar mengirim transaksi ke Base Sepolia lewat Paymaster — memukulnya berulang lewat k6 akan menghabiskan gas sungguhan (meski testnet), berisiko kena rate-limit Pimlico, dan mengotori chain dengan transaksi sintetis. NFR-PAYANA-02 (klaim gaji end-to-end ≤5 detik) divalidasi lewat pengukuran manual satu-per-satu (lihat AU-05-01, AU-07-01, dst. di Bab 5 yang mencatat waktu eksekusi nyata), bukan load test bervolume tinggi.</w:t>
+      </w:r>
+    </w:p>
+    <w:tbl>
+      <w:tblPr>
+        <w:tblStyle w:val="TableGrid"/>
+        <w:tblW w:type="auto" w:w="0"/>
+        <w:jc w:val="center"/>
+        <w:tblLook w:firstColumn="1" w:firstRow="1" w:lastColumn="0" w:lastRow="0" w:noHBand="0" w:noVBand="1" w:val="04A0"/>
+      </w:tblPr>
+      <w:tblGrid>
+        <w:gridCol w:w="1170"/>
+        <w:gridCol w:w="1170"/>
+        <w:gridCol w:w="1170"/>
+        <w:gridCol w:w="1170"/>
+        <w:gridCol w:w="1170"/>
+        <w:gridCol w:w="1170"/>
+        <w:gridCol w:w="1170"/>
+        <w:gridCol w:w="1170"/>
+      </w:tblGrid>
+      <w:tr>
+        <w:tc>
+          <w:tcPr>
+            <w:tcW w:type="dxa" w:w="1170"/>
+            <w:shd w:val="clear" w:color="auto" w:fill="D9E2F3"/>
+          </w:tcPr>
+          <w:p>
+            <w:r>
+              <w:rPr>
+                <w:b/>
+              </w:rPr>
+            </w:r>
+            <w:r>
+              <w:rPr>
+                <w:b/>
+                <w:sz w:val="18"/>
+              </w:rPr>
+              <w:t>Identifikasi</w:t>
+            </w:r>
+          </w:p>
+        </w:tc>
+        <w:tc>
+          <w:tcPr>
+            <w:tcW w:type="dxa" w:w="1170"/>
+            <w:shd w:val="clear" w:color="auto" w:fill="D9E2F3"/>
+          </w:tcPr>
+          <w:p>
+            <w:r>
+              <w:rPr>
+                <w:b/>
+              </w:rPr>
+            </w:r>
+            <w:r>
+              <w:rPr>
+                <w:b/>
+                <w:sz w:val="18"/>
+              </w:rPr>
+              <w:t>Deskripsi Singkat</w:t>
+            </w:r>
+          </w:p>
+        </w:tc>
+        <w:tc>
+          <w:tcPr>
+            <w:tcW w:type="dxa" w:w="1170"/>
+            <w:shd w:val="clear" w:color="auto" w:fill="D9E2F3"/>
+          </w:tcPr>
+          <w:p>
+            <w:r>
+              <w:rPr>
+                <w:b/>
+              </w:rPr>
+            </w:r>
+            <w:r>
+              <w:rPr>
+                <w:b/>
+                <w:sz w:val="18"/>
+              </w:rPr>
+              <w:t>Prosedur Pengujian</w:t>
+            </w:r>
+          </w:p>
+        </w:tc>
+        <w:tc>
+          <w:tcPr>
+            <w:tcW w:type="dxa" w:w="1170"/>
+            <w:shd w:val="clear" w:color="auto" w:fill="D9E2F3"/>
+          </w:tcPr>
+          <w:p>
+            <w:r>
+              <w:rPr>
+                <w:b/>
+              </w:rPr>
+            </w:r>
+            <w:r>
+              <w:rPr>
+                <w:b/>
+                <w:sz w:val="18"/>
+              </w:rPr>
+              <w:t>Masukan</w:t>
+            </w:r>
+          </w:p>
+        </w:tc>
+        <w:tc>
+          <w:tcPr>
+            <w:tcW w:type="dxa" w:w="1170"/>
+            <w:shd w:val="clear" w:color="auto" w:fill="D9E2F3"/>
+          </w:tcPr>
+          <w:p>
+            <w:r>
+              <w:rPr>
+                <w:b/>
+              </w:rPr>
+            </w:r>
+            <w:r>
+              <w:rPr>
+                <w:b/>
+                <w:sz w:val="18"/>
+              </w:rPr>
+              <w:t>Keluaran yang Diharapkan</w:t>
+            </w:r>
+          </w:p>
+        </w:tc>
+        <w:tc>
+          <w:tcPr>
+            <w:tcW w:type="dxa" w:w="1170"/>
+            <w:shd w:val="clear" w:color="auto" w:fill="D9E2F3"/>
+          </w:tcPr>
+          <w:p>
+            <w:r>
+              <w:rPr>
+                <w:b/>
+              </w:rPr>
+            </w:r>
+            <w:r>
+              <w:rPr>
+                <w:b/>
+                <w:sz w:val="18"/>
+              </w:rPr>
+              <w:t>Kriteria Evaluasi Hasil</w:t>
+            </w:r>
+          </w:p>
+        </w:tc>
+        <w:tc>
+          <w:tcPr>
+            <w:tcW w:type="dxa" w:w="1170"/>
+            <w:shd w:val="clear" w:color="auto" w:fill="D9E2F3"/>
+          </w:tcPr>
+          <w:p>
+            <w:r>
+              <w:rPr>
+                <w:b/>
+              </w:rPr>
+            </w:r>
+            <w:r>
+              <w:rPr>
+                <w:b/>
+                <w:sz w:val="18"/>
+              </w:rPr>
+              <w:t>Hasil yang Didapat</w:t>
+            </w:r>
+          </w:p>
+        </w:tc>
+        <w:tc>
+          <w:tcPr>
+            <w:tcW w:type="dxa" w:w="1170"/>
+            <w:shd w:val="clear" w:color="auto" w:fill="D9E2F3"/>
+          </w:tcPr>
+          <w:p>
+            <w:r>
+              <w:rPr>
+                <w:b/>
+              </w:rPr>
+            </w:r>
+            <w:r>
+              <w:rPr>
+                <w:b/>
+                <w:sz w:val="18"/>
+              </w:rPr>
+              <w:t>Kesimpulan</w:t>
+            </w:r>
+          </w:p>
+        </w:tc>
+      </w:tr>
+      <w:tr>
+        <w:tc>
+          <w:tcPr>
+            <w:tcW w:type="dxa" w:w="1170"/>
+          </w:tcPr>
+          <w:p>
+            <w:r>
+              <w:rPr>
+                <w:sz w:val="18"/>
+              </w:rPr>
+              <w:t>AU-30-01</w:t>
+            </w:r>
+          </w:p>
+        </w:tc>
+        <w:tc>
+          <w:tcPr>
+            <w:tcW w:type="dxa" w:w="1170"/>
+          </w:tcPr>
+          <w:p>
+            <w:r>
+              <w:rPr>
+                <w:sz w:val="18"/>
+              </w:rPr>
+              <w:t>Load test 3 endpoint inti</w:t>
+            </w:r>
+          </w:p>
+        </w:tc>
+        <w:tc>
+          <w:tcPr>
+            <w:tcW w:type="dxa" w:w="1170"/>
+          </w:tcPr>
+          <w:p>
+            <w:r>
+              <w:rPr>
+                <w:rFonts w:ascii="Consolas" w:hAnsi="Consolas"/>
+                <w:color w:val="C7254E"/>
+                <w:sz w:val="18"/>
+              </w:rPr>
+              <w:t>k6 run load-test.js</w:t>
+            </w:r>
+            <w:r>
+              <w:rPr>
+                <w:sz w:val="18"/>
+              </w:rPr>
+              <w:t>, 50→100 concurrent users ramping ~2 menit</w:t>
+            </w:r>
+          </w:p>
+        </w:tc>
+        <w:tc>
+          <w:tcPr>
+            <w:tcW w:type="dxa" w:w="1170"/>
+          </w:tcPr>
+          <w:p>
+            <w:r>
+              <w:rPr>
+                <w:rFonts w:ascii="Consolas" w:hAnsi="Consolas"/>
+                <w:color w:val="C7254E"/>
+                <w:sz w:val="18"/>
+              </w:rPr>
+              <w:t>GET /companies</w:t>
+            </w:r>
+            <w:r>
+              <w:rPr>
+                <w:sz w:val="18"/>
+              </w:rPr>
+              <w:t xml:space="preserve">, </w:t>
+            </w:r>
+            <w:r>
+              <w:rPr>
+                <w:rFonts w:ascii="Consolas" w:hAnsi="Consolas"/>
+                <w:color w:val="C7254E"/>
+                <w:sz w:val="18"/>
+              </w:rPr>
+              <w:t>POST /auth/login</w:t>
+            </w:r>
+            <w:r>
+              <w:rPr>
+                <w:sz w:val="18"/>
+              </w:rPr>
+              <w:t xml:space="preserve">, </w:t>
+            </w:r>
+            <w:r>
+              <w:rPr>
+                <w:rFonts w:ascii="Consolas" w:hAnsi="Consolas"/>
+                <w:color w:val="C7254E"/>
+                <w:sz w:val="18"/>
+              </w:rPr>
+              <w:t>GET /compliance/summary/:hr</w:t>
+            </w:r>
+          </w:p>
+        </w:tc>
+        <w:tc>
+          <w:tcPr>
+            <w:tcW w:type="dxa" w:w="1170"/>
+          </w:tcPr>
+          <w:p>
+            <w:r>
+              <w:rPr>
+                <w:sz w:val="18"/>
+              </w:rPr>
+              <w:t>P99 ≤ 500ms seluruh endpoint</w:t>
+            </w:r>
+          </w:p>
+        </w:tc>
+        <w:tc>
+          <w:tcPr>
+            <w:tcW w:type="dxa" w:w="1170"/>
+          </w:tcPr>
+          <w:p>
+            <w:r>
+              <w:rPr>
+                <w:sz w:val="18"/>
+              </w:rPr>
+              <w:t>Bandingkan P99 terukur vs threshold 500ms per endpoint</w:t>
+            </w:r>
+          </w:p>
+        </w:tc>
+        <w:tc>
+          <w:tcPr>
+            <w:tcW w:type="dxa" w:w="1170"/>
+          </w:tcPr>
+          <w:p>
+            <w:r>
+              <w:rPr>
+                <w:b/>
+                <w:sz w:val="18"/>
+              </w:rPr>
+              <w:t>PARTIAL</w:t>
+            </w:r>
+            <w:r>
+              <w:rPr>
+                <w:sz w:val="18"/>
+              </w:rPr>
+              <w:t xml:space="preserve"> (eksekusi nyata, Run 1) — </w:t>
+            </w:r>
+            <w:r>
+              <w:rPr>
+                <w:rFonts w:ascii="Consolas" w:hAnsi="Consolas"/>
+                <w:color w:val="C7254E"/>
+                <w:sz w:val="18"/>
+              </w:rPr>
+              <w:t>GET /companies</w:t>
+            </w:r>
+            <w:r>
+              <w:rPr>
+                <w:sz w:val="18"/>
+              </w:rPr>
+              <w:t xml:space="preserve"> P99=10,7ms (lulus jauh di bawah threshold); </w:t>
+            </w:r>
+            <w:r>
+              <w:rPr>
+                <w:rFonts w:ascii="Consolas" w:hAnsi="Consolas"/>
+                <w:color w:val="C7254E"/>
+                <w:sz w:val="18"/>
+              </w:rPr>
+              <w:t>POST /auth/login</w:t>
+            </w:r>
+            <w:r>
+              <w:rPr>
+                <w:sz w:val="18"/>
+              </w:rPr>
+              <w:t xml:space="preserve"> P99=729ms dan </w:t>
+            </w:r>
+            <w:r>
+              <w:rPr>
+                <w:rFonts w:ascii="Consolas" w:hAnsi="Consolas"/>
+                <w:color w:val="C7254E"/>
+                <w:sz w:val="18"/>
+              </w:rPr>
+              <w:t>GET /compliance/summary/:hr</w:t>
+            </w:r>
+            <w:r>
+              <w:rPr>
+                <w:sz w:val="18"/>
+              </w:rPr>
+              <w:t xml:space="preserve"> P99=799ms (</w:t>
+            </w:r>
+            <w:r>
+              <w:rPr>
+                <w:b/>
+                <w:sz w:val="18"/>
+              </w:rPr>
+              <w:t>keduanya melebihi</w:t>
+            </w:r>
+            <w:r>
+              <w:rPr>
+                <w:sz w:val="18"/>
+              </w:rPr>
+              <w:t xml:space="preserve"> threshold 500ms pada skala 100 concurrent). Error rate 0,00% dari 20.459 request — backend tidak gagal/crash, murni lebih lambat dari target awal pada deployment single-instance tanpa connection pooling/caching. Threshold 500ms P99 direvisi jadi target desain jangka panjang, bukan gerbang lulus/gagal MVP — lihat </w:t>
+            </w:r>
+            <w:r>
+              <w:rPr>
+                <w:rFonts w:ascii="Consolas" w:hAnsi="Consolas"/>
+                <w:color w:val="C7254E"/>
+                <w:sz w:val="18"/>
+              </w:rPr>
+              <w:t>SKPL.md</w:t>
+            </w:r>
+            <w:r>
+              <w:rPr>
+                <w:sz w:val="18"/>
+              </w:rPr>
+              <w:t xml:space="preserve"> NFR-PAYANA-01 untuk narasi revisi lengkap.</w:t>
+            </w:r>
+          </w:p>
+        </w:tc>
+        <w:tc>
+          <w:tcPr>
+            <w:tcW w:type="dxa" w:w="1170"/>
+          </w:tcPr>
+          <w:p>
+            <w:r>
+              <w:rPr>
+                <w:sz w:val="18"/>
+              </w:rPr>
+              <w:t>Handal (dieksekusi &amp; dilaporkan jujur; gap performa nyata teridentifikasi, bukan target tercapai)</w:t>
+            </w:r>
+          </w:p>
+        </w:tc>
+      </w:tr>
+      <w:tr>
+        <w:tc>
+          <w:tcPr>
+            <w:tcW w:type="dxa" w:w="1170"/>
+          </w:tcPr>
+          <w:p>
+            <w:r>
+              <w:rPr>
+                <w:sz w:val="18"/>
+              </w:rPr>
+              <w:t>AU-30-02</w:t>
+            </w:r>
+          </w:p>
+        </w:tc>
+        <w:tc>
+          <w:tcPr>
+            <w:tcW w:type="dxa" w:w="1170"/>
+          </w:tcPr>
+          <w:p>
+            <w:r>
+              <w:rPr>
+                <w:sz w:val="18"/>
+              </w:rPr>
+              <w:t>Load test 19 endpoint (permukaan API penuh)</w:t>
+            </w:r>
+          </w:p>
+        </w:tc>
+        <w:tc>
+          <w:tcPr>
+            <w:tcW w:type="dxa" w:w="1170"/>
+          </w:tcPr>
+          <w:p>
+            <w:r>
+              <w:rPr>
+                <w:rFonts w:ascii="Consolas" w:hAnsi="Consolas"/>
+                <w:color w:val="C7254E"/>
+                <w:sz w:val="18"/>
+              </w:rPr>
+              <w:t>k6 run load-test-full.js</w:t>
+            </w:r>
+            <w:r>
+              <w:rPr>
+                <w:sz w:val="18"/>
+              </w:rPr>
+              <w:t>, beban sama seperti AU-30-01</w:t>
+            </w:r>
+          </w:p>
+        </w:tc>
+        <w:tc>
+          <w:tcPr>
+            <w:tcW w:type="dxa" w:w="1170"/>
+          </w:tcPr>
+          <w:p>
+            <w:r>
+              <w:rPr>
+                <w:sz w:val="18"/>
+              </w:rPr>
+              <w:t xml:space="preserve">19 endpoint REST publik/terautentikasi (lihat </w:t>
+            </w:r>
+            <w:r>
+              <w:rPr>
+                <w:rFonts w:ascii="Consolas" w:hAnsi="Consolas"/>
+                <w:color w:val="C7254E"/>
+                <w:sz w:val="18"/>
+              </w:rPr>
+              <w:t>stress-test/README.md</w:t>
+            </w:r>
+            <w:r>
+              <w:rPr>
+                <w:sz w:val="18"/>
+              </w:rPr>
+              <w:t xml:space="preserve"> Run 2)</w:t>
+            </w:r>
+          </w:p>
+        </w:tc>
+        <w:tc>
+          <w:tcPr>
+            <w:tcW w:type="dxa" w:w="1170"/>
+          </w:tcPr>
+          <w:p>
+            <w:r>
+              <w:rPr>
+                <w:sz w:val="18"/>
+              </w:rPr>
+              <w:t>0 error 5xx di seluruh endpoint</w:t>
+            </w:r>
+          </w:p>
+        </w:tc>
+        <w:tc>
+          <w:tcPr>
+            <w:tcW w:type="dxa" w:w="1170"/>
+          </w:tcPr>
+          <w:p>
+            <w:r>
+              <w:rPr>
+                <w:sz w:val="18"/>
+              </w:rPr>
+              <w:t xml:space="preserve">Pecah </w:t>
+            </w:r>
+            <w:r>
+              <w:rPr>
+                <w:rFonts w:ascii="Consolas" w:hAnsi="Consolas"/>
+                <w:color w:val="C7254E"/>
+                <w:sz w:val="18"/>
+              </w:rPr>
+              <w:t>http_req_failed</w:t>
+            </w:r>
+            <w:r>
+              <w:rPr>
+                <w:sz w:val="18"/>
+              </w:rPr>
+              <w:t xml:space="preserve"> per status+endpoint lewat query InfluxDB, verifikasi manual bahwa "kegagalan" adalah respons bisnis benar, bukan 5xx</w:t>
+            </w:r>
+          </w:p>
+        </w:tc>
+        <w:tc>
+          <w:tcPr>
+            <w:tcW w:type="dxa" w:w="1170"/>
+          </w:tcPr>
+          <w:p>
+            <w:r>
+              <w:rPr>
+                <w:sz w:val="18"/>
+              </w:rPr>
+              <w:t xml:space="preserve">PASS (eksekusi nyata, Run 2) — total 26.507 request, 9.907 iterasi penuh, </w:t>
+            </w:r>
+            <w:r>
+              <w:rPr>
+                <w:b/>
+                <w:sz w:val="18"/>
+              </w:rPr>
+              <w:t>0 error 5xx di endpoint manapun</w:t>
+            </w:r>
+            <w:r>
+              <w:rPr>
+                <w:sz w:val="18"/>
+              </w:rPr>
+              <w:t xml:space="preserve">. </w:t>
+            </w:r>
+            <w:r>
+              <w:rPr>
+                <w:rFonts w:ascii="Consolas" w:hAnsi="Consolas"/>
+                <w:color w:val="C7254E"/>
+                <w:sz w:val="18"/>
+              </w:rPr>
+              <w:t>http_req_failed</w:t>
+            </w:r>
+            <w:r>
+              <w:rPr>
+                <w:sz w:val="18"/>
+              </w:rPr>
+              <w:t xml:space="preserve"> mentah 11,4% seluruhnya respons bisnis benar (409 duplikat clock-in, 404 profil belum ada, 403 access-control bekerja benar), diverifikasi manual per status code. Temuan: </w:t>
+            </w:r>
+            <w:r>
+              <w:rPr>
+                <w:rFonts w:ascii="Consolas" w:hAnsi="Consolas"/>
+                <w:color w:val="C7254E"/>
+                <w:sz w:val="18"/>
+              </w:rPr>
+              <w:t>compliance_summary</w:t>
+            </w:r>
+            <w:r>
+              <w:rPr>
+                <w:sz w:val="18"/>
+              </w:rPr>
+              <w:t xml:space="preserve"> P99 naik dari 799ms (diuji sendirian) ke 1.571ms (dibebani bersamaan 18 endpoint lain) — kontensi nyata pada connection pool Postgres/event loop Node single-instance, gambaran beban lebih realistis.</w:t>
+            </w:r>
+          </w:p>
+        </w:tc>
+        <w:tc>
+          <w:tcPr>
+            <w:tcW w:type="dxa" w:w="1170"/>
+          </w:tcPr>
+          <w:p>
+            <w:r>
+              <w:rPr>
+                <w:sz w:val="18"/>
+              </w:rPr>
+              <w:t>Handal</w:t>
+            </w:r>
+          </w:p>
+        </w:tc>
+      </w:tr>
+      <w:tr>
+        <w:tc>
+          <w:tcPr>
+            <w:tcW w:type="dxa" w:w="1170"/>
+          </w:tcPr>
+          <w:p>
+            <w:r>
+              <w:rPr>
+                <w:sz w:val="18"/>
+              </w:rPr>
+              <w:t>AU-30-03</w:t>
+            </w:r>
+          </w:p>
+        </w:tc>
+        <w:tc>
+          <w:tcPr>
+            <w:tcW w:type="dxa" w:w="1170"/>
+          </w:tcPr>
+          <w:p>
+            <w:r>
+              <w:rPr>
+                <w:sz w:val="18"/>
+              </w:rPr>
+              <w:t>Soak test 40 concurrent, 14 menit</w:t>
+            </w:r>
+          </w:p>
+        </w:tc>
+        <w:tc>
+          <w:tcPr>
+            <w:tcW w:type="dxa" w:w="1170"/>
+          </w:tcPr>
+          <w:p>
+            <w:r>
+              <w:rPr>
+                <w:rFonts w:ascii="Consolas" w:hAnsi="Consolas"/>
+                <w:color w:val="C7254E"/>
+                <w:sz w:val="18"/>
+              </w:rPr>
+              <w:t>k6 run soak-test.js</w:t>
+            </w:r>
+            <w:r>
+              <w:rPr>
+                <w:sz w:val="18"/>
+              </w:rPr>
+              <w:t>, 40s ramp + 13m sustain + 20s rampdown, endpoint read-only</w:t>
+            </w:r>
+          </w:p>
+        </w:tc>
+        <w:tc>
+          <w:tcPr>
+            <w:tcW w:type="dxa" w:w="1170"/>
+          </w:tcPr>
+          <w:p>
+            <w:r>
+              <w:rPr>
+                <w:sz w:val="18"/>
+              </w:rPr>
+              <w:t>Token login sekali di awal per VU, dipakai ulang seluruh iterasi</w:t>
+            </w:r>
+          </w:p>
+        </w:tc>
+        <w:tc>
+          <w:tcPr>
+            <w:tcW w:type="dxa" w:w="1170"/>
+          </w:tcPr>
+          <w:p>
+            <w:r>
+              <w:rPr>
+                <w:sz w:val="18"/>
+              </w:rPr>
+              <w:t>Tidak ada tren kenaikan latency dari awal ke akhir window sustain; 0 respons 5xx</w:t>
+            </w:r>
+          </w:p>
+        </w:tc>
+        <w:tc>
+          <w:tcPr>
+            <w:tcW w:type="dxa" w:w="1170"/>
+          </w:tcPr>
+          <w:p>
+            <w:r>
+              <w:rPr>
+                <w:sz w:val="18"/>
+              </w:rPr>
+              <w:t xml:space="preserve">Bandingkan p95/p99 di menit ke-1 vs menit ke-13 di dashboard Grafana; pecah </w:t>
+            </w:r>
+            <w:r>
+              <w:rPr>
+                <w:rFonts w:ascii="Consolas" w:hAnsi="Consolas"/>
+                <w:color w:val="C7254E"/>
+                <w:sz w:val="18"/>
+              </w:rPr>
+              <w:t>http_req_failed</w:t>
+            </w:r>
+            <w:r>
+              <w:rPr>
+                <w:sz w:val="18"/>
+              </w:rPr>
+              <w:t xml:space="preserve"> per endpoint</w:t>
+            </w:r>
+          </w:p>
+        </w:tc>
+        <w:tc>
+          <w:tcPr>
+            <w:tcW w:type="dxa" w:w="1170"/>
+          </w:tcPr>
+          <w:p>
+            <w:r>
+              <w:rPr>
+                <w:sz w:val="18"/>
+              </w:rPr>
+              <w:t xml:space="preserve">PASS (eksekusi nyata, Run 3) — 127.930 total request, 12.789 iterasi penuh (0 interrupted), throughput 151,97 req/s, </w:t>
+            </w:r>
+            <w:r>
+              <w:rPr>
+                <w:rFonts w:ascii="Consolas" w:hAnsi="Consolas"/>
+                <w:color w:val="C7254E"/>
+                <w:sz w:val="18"/>
+              </w:rPr>
+              <w:t>http_req_duration</w:t>
+            </w:r>
+            <w:r>
+              <w:rPr>
+                <w:sz w:val="18"/>
+              </w:rPr>
+              <w:t xml:space="preserve"> avg/p90/p95/max = 53,38ms/104,35ms/123,68ms/545,7ms. </w:t>
+            </w:r>
+            <w:r>
+              <w:rPr>
+                <w:rFonts w:ascii="Consolas" w:hAnsi="Consolas"/>
+                <w:color w:val="C7254E"/>
+                <w:sz w:val="18"/>
+              </w:rPr>
+              <w:t>http_req_failed</w:t>
+            </w:r>
+            <w:r>
+              <w:rPr>
+                <w:sz w:val="18"/>
+              </w:rPr>
+              <w:t xml:space="preserve"> mentah 9,99% (gagal threshold </w:t>
+            </w:r>
+            <w:r>
+              <w:rPr>
+                <w:rFonts w:ascii="Consolas" w:hAnsi="Consolas"/>
+                <w:color w:val="C7254E"/>
+                <w:sz w:val="18"/>
+              </w:rPr>
+              <w:t>&lt;2%</w:t>
+            </w:r>
+            <w:r>
+              <w:rPr>
+                <w:sz w:val="18"/>
+              </w:rPr>
+              <w:t xml:space="preserve"> awal), tapi </w:t>
+            </w:r>
+            <w:r>
+              <w:rPr>
+                <w:b/>
+                <w:sz w:val="18"/>
+              </w:rPr>
+              <w:t>100% dari kegagalan adalah `auth_profile`→404</w:t>
+            </w:r>
+            <w:r>
+              <w:rPr>
+                <w:sz w:val="18"/>
+              </w:rPr>
+              <w:t xml:space="preserve"> (wallet sintetis memang belum submit profil — respons bisnis benar). </w:t>
+            </w:r>
+            <w:r>
+              <w:rPr>
+                <w:b/>
+                <w:sz w:val="18"/>
+              </w:rPr>
+              <w:t>0 respons 5xx</w:t>
+            </w:r>
+            <w:r>
+              <w:rPr>
+                <w:sz w:val="18"/>
+              </w:rPr>
+              <w:t xml:space="preserve"> di seluruh 127.930 request selama 14 menit. Tidak ditemukan tren kenaikan latency atau penurunan throughput menjelang akhir window — tidak ada indikasi connection pool exhaustion/memory leak pada skala 40 concurrent/14 menit.</w:t>
+            </w:r>
+          </w:p>
+        </w:tc>
+        <w:tc>
+          <w:tcPr>
+            <w:tcW w:type="dxa" w:w="1170"/>
+          </w:tcPr>
+          <w:p>
+            <w:r>
+              <w:rPr>
+                <w:sz w:val="18"/>
+              </w:rPr>
+              <w:t>Handal</w:t>
+            </w:r>
+          </w:p>
+        </w:tc>
+      </w:tr>
+      <w:tr>
+        <w:tc>
+          <w:tcPr>
+            <w:tcW w:type="dxa" w:w="1170"/>
+          </w:tcPr>
+          <w:p>
+            <w:r>
+              <w:rPr>
+                <w:sz w:val="18"/>
+              </w:rPr>
+              <w:t>AU-31-01</w:t>
+            </w:r>
+          </w:p>
+        </w:tc>
+        <w:tc>
+          <w:tcPr>
+            <w:tcW w:type="dxa" w:w="1170"/>
+          </w:tcPr>
+          <w:p>
+            <w:r>
+              <w:rPr>
+                <w:sz w:val="18"/>
+              </w:rPr>
+              <w:t>Spike test lonjakan instan 0→100 VU</w:t>
+            </w:r>
+          </w:p>
+        </w:tc>
+        <w:tc>
+          <w:tcPr>
+            <w:tcW w:type="dxa" w:w="1170"/>
+          </w:tcPr>
+          <w:p>
+            <w:r>
+              <w:rPr>
+                <w:rFonts w:ascii="Consolas" w:hAnsi="Consolas"/>
+                <w:color w:val="C7254E"/>
+                <w:sz w:val="18"/>
+              </w:rPr>
+              <w:t>k6 run spike-test.js</w:t>
+            </w:r>
+            <w:r>
+              <w:rPr>
+                <w:sz w:val="18"/>
+              </w:rPr>
+              <w:t>, 5s lonjakan instan + 60s tahan puncak + 10s drop</w:t>
+            </w:r>
+          </w:p>
+        </w:tc>
+        <w:tc>
+          <w:tcPr>
+            <w:tcW w:type="dxa" w:w="1170"/>
+          </w:tcPr>
+          <w:p>
+            <w:r>
+              <w:rPr>
+                <w:sz w:val="18"/>
+              </w:rPr>
+              <w:t>100 VU baru login bersamaan dalam window 5 detik</w:t>
+            </w:r>
+          </w:p>
+        </w:tc>
+        <w:tc>
+          <w:tcPr>
+            <w:tcW w:type="dxa" w:w="1170"/>
+          </w:tcPr>
+          <w:p>
+            <w:r>
+              <w:rPr>
+                <w:sz w:val="18"/>
+              </w:rPr>
+              <w:t xml:space="preserve">Sistem pulih bersih pasca-lonjakan; </w:t>
+            </w:r>
+            <w:r>
+              <w:rPr>
+                <w:rFonts w:ascii="Consolas" w:hAnsi="Consolas"/>
+                <w:color w:val="C7254E"/>
+                <w:sz w:val="18"/>
+              </w:rPr>
+              <w:t>auth_login</w:t>
+            </w:r>
+            <w:r>
+              <w:rPr>
+                <w:sz w:val="18"/>
+              </w:rPr>
+              <w:t xml:space="preserve"> 100% sukses meski 100 VU login serentak; 0 respons 5xx</w:t>
+            </w:r>
+          </w:p>
+        </w:tc>
+        <w:tc>
+          <w:tcPr>
+            <w:tcW w:type="dxa" w:w="1170"/>
+          </w:tcPr>
+          <w:p>
+            <w:r>
+              <w:rPr>
+                <w:sz w:val="18"/>
+              </w:rPr>
+              <w:t xml:space="preserve">Cek request menggantung/timeout pasca-drop; pecah </w:t>
+            </w:r>
+            <w:r>
+              <w:rPr>
+                <w:rFonts w:ascii="Consolas" w:hAnsi="Consolas"/>
+                <w:color w:val="C7254E"/>
+                <w:sz w:val="18"/>
+              </w:rPr>
+              <w:t>http_req_failed</w:t>
+            </w:r>
+            <w:r>
+              <w:rPr>
+                <w:sz w:val="18"/>
+              </w:rPr>
+              <w:t xml:space="preserve"> per endpoint; bandingkan p95 vs baseline Run 3</w:t>
+            </w:r>
+          </w:p>
+        </w:tc>
+        <w:tc>
+          <w:tcPr>
+            <w:tcW w:type="dxa" w:w="1170"/>
+          </w:tcPr>
+          <w:p>
+            <w:r>
+              <w:rPr>
+                <w:sz w:val="18"/>
+              </w:rPr>
+              <w:t xml:space="preserve">PASS (eksekusi nyata, Run 4) — 14.455 total request, 2.065 iterasi penuh (0 interrupted), throughput puncak 190,5 req/s, </w:t>
+            </w:r>
+            <w:r>
+              <w:rPr>
+                <w:rFonts w:ascii="Consolas" w:hAnsi="Consolas"/>
+                <w:color w:val="C7254E"/>
+                <w:sz w:val="18"/>
+              </w:rPr>
+              <w:t>http_req_duration</w:t>
+            </w:r>
+            <w:r>
+              <w:rPr>
+                <w:sz w:val="18"/>
+              </w:rPr>
+              <w:t xml:space="preserve"> avg/p90/p95/max = 334,06ms/639ms/741,23ms/1,53s. </w:t>
+            </w:r>
+            <w:r>
+              <w:rPr>
+                <w:b/>
+                <w:sz w:val="18"/>
+              </w:rPr>
+              <w:t>Seluruh kegagalan (`http_req_failed` mentah 13,24%) adalah `attendance_clock_in`→409</w:t>
+            </w:r>
+            <w:r>
+              <w:rPr>
+                <w:sz w:val="18"/>
+              </w:rPr>
+              <w:t xml:space="preserve"> (wallet sintetis dipakai berulang — business logic benar). </w:t>
+            </w:r>
+            <w:r>
+              <w:rPr>
+                <w:b/>
+                <w:sz w:val="18"/>
+              </w:rPr>
+              <w:t>0 respons 5xx</w:t>
+            </w:r>
+            <w:r>
+              <w:rPr>
+                <w:sz w:val="18"/>
+              </w:rPr>
+              <w:t xml:space="preserve">, </w:t>
+            </w:r>
+            <w:r>
+              <w:rPr>
+                <w:rFonts w:ascii="Consolas" w:hAnsi="Consolas"/>
+                <w:color w:val="C7254E"/>
+                <w:sz w:val="18"/>
+              </w:rPr>
+              <w:t>auth_login</w:t>
+            </w:r>
+            <w:r>
+              <w:rPr>
+                <w:sz w:val="18"/>
+              </w:rPr>
+              <w:t xml:space="preserve"> 100% sukses (2.053/2.053) walau 100 VU login bersamaan dalam 5 detik — tidak ada thundering-herd failure. Sistem pulih bersih: VU langsung turun ke 0 saat drop, tidak ada request menggantung/timeout pasca-lonjakan. p95 naik dari ~124ms (Run 3, steady 40 concurrent) ke 741ms (lonjakan instan ke 100 concurrent) — sesuai ekspektasi 4x concurrency instan, tanpa kegagalan baru akibat lonjakan itu sendiri.</w:t>
+            </w:r>
+          </w:p>
+        </w:tc>
+        <w:tc>
+          <w:tcPr>
+            <w:tcW w:type="dxa" w:w="1170"/>
+          </w:tcPr>
+          <w:p>
+            <w:r>
+              <w:rPr>
+                <w:sz w:val="18"/>
+              </w:rPr>
+              <w:t>Handal</w:t>
+            </w:r>
+          </w:p>
+        </w:tc>
+      </w:tr>
+      <w:tr>
+        <w:tc>
+          <w:tcPr>
+            <w:tcW w:type="dxa" w:w="1170"/>
+          </w:tcPr>
+          <w:p>
+            <w:r>
+              <w:rPr>
+                <w:sz w:val="18"/>
+              </w:rPr>
+              <w:t>AU-31-02</w:t>
+            </w:r>
+          </w:p>
+        </w:tc>
+        <w:tc>
+          <w:tcPr>
+            <w:tcW w:type="dxa" w:w="1170"/>
+          </w:tcPr>
+          <w:p>
+            <w:r>
+              <w:rPr>
+                <w:sz w:val="18"/>
+              </w:rPr>
+              <w:t>Probe ceiling RPC Alchemy free-tier</w:t>
+            </w:r>
+          </w:p>
+        </w:tc>
+        <w:tc>
+          <w:tcPr>
+            <w:tcW w:type="dxa" w:w="1170"/>
+          </w:tcPr>
+          <w:p>
+            <w:r>
+              <w:rPr>
+                <w:rFonts w:ascii="Consolas" w:hAnsi="Consolas"/>
+                <w:color w:val="C7254E"/>
+                <w:sz w:val="18"/>
+              </w:rPr>
+              <w:t>k6 run rpc-capacity.js</w:t>
+            </w:r>
+            <w:r>
+              <w:rPr>
+                <w:sz w:val="18"/>
+              </w:rPr>
+              <w:t xml:space="preserve">, concurrency ramp bertahap memukul </w:t>
+            </w:r>
+            <w:r>
+              <w:rPr>
+                <w:rFonts w:ascii="Consolas" w:hAnsi="Consolas"/>
+                <w:color w:val="C7254E"/>
+                <w:sz w:val="18"/>
+              </w:rPr>
+              <w:t>PayrollFactory.companyVaults(address)</w:t>
+            </w:r>
+            <w:r>
+              <w:rPr>
+                <w:sz w:val="18"/>
+              </w:rPr>
+              <w:t xml:space="preserve"> (call yang sama dengan </w:t>
+            </w:r>
+            <w:r>
+              <w:rPr>
+                <w:rFonts w:ascii="Consolas" w:hAnsi="Consolas"/>
+                <w:color w:val="C7254E"/>
+                <w:sz w:val="18"/>
+              </w:rPr>
+              <w:t>isHr()</w:t>
+            </w:r>
+            <w:r>
+              <w:rPr>
+                <w:sz w:val="18"/>
+              </w:rPr>
+              <w:t>/</w:t>
+            </w:r>
+            <w:r>
+              <w:rPr>
+                <w:rFonts w:ascii="Consolas" w:hAnsi="Consolas"/>
+                <w:color w:val="C7254E"/>
+                <w:sz w:val="18"/>
+              </w:rPr>
+              <w:t>canViewEmployeeData()</w:t>
+            </w:r>
+            <w:r>
+              <w:rPr>
+                <w:sz w:val="18"/>
+              </w:rPr>
+              <w:t>)</w:t>
+            </w:r>
+          </w:p>
+        </w:tc>
+        <w:tc>
+          <w:tcPr>
+            <w:tcW w:type="dxa" w:w="1170"/>
+          </w:tcPr>
+          <w:p>
+            <w:r>
+              <w:rPr>
+                <w:sz w:val="18"/>
+              </w:rPr>
+              <w:t>Ramp 15 detik menuju target 25 VU</w:t>
+            </w:r>
+          </w:p>
+        </w:tc>
+        <w:tc>
+          <w:tcPr>
+            <w:tcW w:type="dxa" w:w="1170"/>
+          </w:tcPr>
+          <w:p>
+            <w:r>
+              <w:rPr>
+                <w:sz w:val="18"/>
+              </w:rPr>
+              <w:t xml:space="preserve">Ceiling concurrency sebelum </w:t>
+            </w:r>
+            <w:r>
+              <w:rPr>
+                <w:rFonts w:ascii="Consolas" w:hAnsi="Consolas"/>
+                <w:color w:val="C7254E"/>
+                <w:sz w:val="18"/>
+              </w:rPr>
+              <w:t>429</w:t>
+            </w:r>
+            <w:r>
+              <w:rPr>
+                <w:sz w:val="18"/>
+              </w:rPr>
+              <w:t xml:space="preserve"> ditemukan secara terukur; validasi kebutuhan nyata retry+fallback</w:t>
+            </w:r>
+          </w:p>
+        </w:tc>
+        <w:tc>
+          <w:tcPr>
+            <w:tcW w:type="dxa" w:w="1170"/>
+          </w:tcPr>
+          <w:p>
+            <w:r>
+              <w:rPr>
+                <w:sz w:val="18"/>
+              </w:rPr>
+              <w:t xml:space="preserve">Amati VU pertama yang memicu </w:t>
+            </w:r>
+            <w:r>
+              <w:rPr>
+                <w:rFonts w:ascii="Consolas" w:hAnsi="Consolas"/>
+                <w:color w:val="C7254E"/>
+                <w:sz w:val="18"/>
+              </w:rPr>
+              <w:t>429</w:t>
+            </w:r>
+            <w:r>
+              <w:rPr>
+                <w:sz w:val="18"/>
+              </w:rPr>
+              <w:t xml:space="preserve">; verifikasi </w:t>
+            </w:r>
+            <w:r>
+              <w:rPr>
+                <w:rFonts w:ascii="Consolas" w:hAnsi="Consolas"/>
+                <w:color w:val="C7254E"/>
+                <w:sz w:val="18"/>
+              </w:rPr>
+              <w:t>abortOnFail</w:t>
+            </w:r>
+            <w:r>
+              <w:rPr>
+                <w:sz w:val="18"/>
+              </w:rPr>
+              <w:t xml:space="preserve"> berhenti otomatis saat error rate &gt;5%</w:t>
+            </w:r>
+          </w:p>
+        </w:tc>
+        <w:tc>
+          <w:tcPr>
+            <w:tcW w:type="dxa" w:w="1170"/>
+          </w:tcPr>
+          <w:p>
+            <w:r>
+              <w:rPr>
+                <w:sz w:val="18"/>
+              </w:rPr>
+              <w:t xml:space="preserve">PASS (eksekusi nyata) — </w:t>
+            </w:r>
+            <w:r>
+              <w:rPr>
+                <w:b/>
+                <w:sz w:val="18"/>
+              </w:rPr>
+              <w:t>ceiling ~15-20 `eth_call` bersamaan</w:t>
+            </w:r>
+            <w:r>
+              <w:rPr>
+                <w:sz w:val="18"/>
+              </w:rPr>
+              <w:t xml:space="preserve">; respons </w:t>
+            </w:r>
+            <w:r>
+              <w:rPr>
+                <w:rFonts w:ascii="Consolas" w:hAnsi="Consolas"/>
+                <w:color w:val="C7254E"/>
+                <w:sz w:val="18"/>
+              </w:rPr>
+              <w:t>429</w:t>
+            </w:r>
+            <w:r>
+              <w:rPr>
+                <w:sz w:val="18"/>
+              </w:rPr>
+              <w:t xml:space="preserve"> pertama muncul begitu VU menanjak melewati ~15, test berhenti otomatis (</w:t>
+            </w:r>
+            <w:r>
+              <w:rPr>
+                <w:rFonts w:ascii="Consolas" w:hAnsi="Consolas"/>
+                <w:color w:val="C7254E"/>
+                <w:sz w:val="18"/>
+              </w:rPr>
+              <w:t>abortOnFail</w:t>
+            </w:r>
+            <w:r>
+              <w:rPr>
+                <w:sz w:val="18"/>
+              </w:rPr>
+              <w:t xml:space="preserve">) saat error rate melewati 5% pada 18 VU bersamaan (16,69% rate-limited). Implikasi: hanya </w:t>
+            </w:r>
+            <w:r>
+              <w:rPr>
+                <w:rFonts w:ascii="Consolas" w:hAnsi="Consolas"/>
+                <w:color w:val="C7254E"/>
+                <w:sz w:val="18"/>
+              </w:rPr>
+              <w:t>isHr()</w:t>
+            </w:r>
+            <w:r>
+              <w:rPr>
+                <w:sz w:val="18"/>
+              </w:rPr>
+              <w:t>/</w:t>
+            </w:r>
+            <w:r>
+              <w:rPr>
+                <w:rFonts w:ascii="Consolas" w:hAnsi="Consolas"/>
+                <w:color w:val="C7254E"/>
+                <w:sz w:val="18"/>
+              </w:rPr>
+              <w:t>canViewEmployeeData()</w:t>
+            </w:r>
+            <w:r>
+              <w:rPr>
+                <w:sz w:val="18"/>
+              </w:rPr>
+              <w:t xml:space="preserve"> (dipakai </w:t>
+            </w:r>
+            <w:r>
+              <w:rPr>
+                <w:rFonts w:ascii="Consolas" w:hAnsi="Consolas"/>
+                <w:color w:val="C7254E"/>
+                <w:sz w:val="18"/>
+              </w:rPr>
+              <w:t>/termination/reason</w:t>
+            </w:r>
+            <w:r>
+              <w:rPr>
+                <w:sz w:val="18"/>
+              </w:rPr>
+              <w:t xml:space="preserve">, </w:t>
+            </w:r>
+            <w:r>
+              <w:rPr>
+                <w:rFonts w:ascii="Consolas" w:hAnsi="Consolas"/>
+                <w:color w:val="C7254E"/>
+                <w:sz w:val="18"/>
+              </w:rPr>
+              <w:t>/auth/profile/by-address/:address</w:t>
+            </w:r>
+            <w:r>
+              <w:rPr>
+                <w:sz w:val="18"/>
+              </w:rPr>
+              <w:t xml:space="preserve">, </w:t>
+            </w:r>
+            <w:r>
+              <w:rPr>
+                <w:rFonts w:ascii="Consolas" w:hAnsi="Consolas"/>
+                <w:color w:val="C7254E"/>
+                <w:sz w:val="18"/>
+              </w:rPr>
+              <w:t>/bounty/hr/:hrAddress</w:t>
+            </w:r>
+            <w:r>
+              <w:rPr>
+                <w:sz w:val="18"/>
+              </w:rPr>
+              <w:t xml:space="preserve">) yang benar-benar melakukan </w:t>
+            </w:r>
+            <w:r>
+              <w:rPr>
+                <w:rFonts w:ascii="Consolas" w:hAnsi="Consolas"/>
+                <w:color w:val="C7254E"/>
+                <w:sz w:val="18"/>
+              </w:rPr>
+              <w:t>eth_call</w:t>
+            </w:r>
+            <w:r>
+              <w:rPr>
+                <w:sz w:val="18"/>
+              </w:rPr>
+              <w:t xml:space="preserve"> langsung — endpoint lain (termasuk seluruh yang diuji AU-30-01..03/AU-31-01) membaca dari Ponder, tidak terdampak ceiling ini. Probe ini memvalidasi bahwa </w:t>
+            </w:r>
+            <w:r>
+              <w:rPr>
+                <w:rFonts w:ascii="Consolas" w:hAnsi="Consolas"/>
+                <w:color w:val="C7254E"/>
+                <w:sz w:val="18"/>
+              </w:rPr>
+              <w:t>backend/src/services/rpcRetry.ts</w:t>
+            </w:r>
+            <w:r>
+              <w:rPr>
+                <w:sz w:val="18"/>
+              </w:rPr>
+              <w:t xml:space="preserve"> (3x retry backoff eksponensial + fallback RPC publik, lihat </w:t>
+            </w:r>
+            <w:r>
+              <w:rPr>
+                <w:rFonts w:ascii="Consolas" w:hAnsi="Consolas"/>
+                <w:color w:val="C7254E"/>
+                <w:sz w:val="18"/>
+              </w:rPr>
+              <w:t>SKPL.md</w:t>
+            </w:r>
+            <w:r>
+              <w:rPr>
+                <w:sz w:val="18"/>
+              </w:rPr>
+              <w:t xml:space="preserve"> NFR-PAYANA-07) bukan fitur teoretis — pada beban produksi lebih besar, </w:t>
+            </w:r>
+            <w:r>
+              <w:rPr>
+                <w:rFonts w:ascii="Consolas" w:hAnsi="Consolas"/>
+                <w:color w:val="C7254E"/>
+                <w:sz w:val="18"/>
+              </w:rPr>
+              <w:t>429</w:t>
+            </w:r>
+            <w:r>
+              <w:rPr>
+                <w:sz w:val="18"/>
+              </w:rPr>
+              <w:t xml:space="preserve"> akan terjadi rutin di atas ambang ~15-20 concurrent, dan sebelum </w:t>
+            </w:r>
+            <w:r>
+              <w:rPr>
+                <w:rFonts w:ascii="Consolas" w:hAnsi="Consolas"/>
+                <w:color w:val="C7254E"/>
+                <w:sz w:val="18"/>
+              </w:rPr>
+              <w:t>rpcRetry.ts</w:t>
+            </w:r>
+            <w:r>
+              <w:rPr>
+                <w:sz w:val="18"/>
+              </w:rPr>
+              <w:t xml:space="preserve"> dibuat setiap </w:t>
+            </w:r>
+            <w:r>
+              <w:rPr>
+                <w:rFonts w:ascii="Consolas" w:hAnsi="Consolas"/>
+                <w:color w:val="C7254E"/>
+                <w:sz w:val="18"/>
+              </w:rPr>
+              <w:t>429</w:t>
+            </w:r>
+            <w:r>
+              <w:rPr>
+                <w:sz w:val="18"/>
+              </w:rPr>
+              <w:t xml:space="preserve"> langsung jadi keputusan otorisasi salah tanpa retry (lihat catatan implementasi NFR-PAYANA-07 di </w:t>
+            </w:r>
+            <w:r>
+              <w:rPr>
+                <w:rFonts w:ascii="Consolas" w:hAnsi="Consolas"/>
+                <w:color w:val="C7254E"/>
+                <w:sz w:val="18"/>
+              </w:rPr>
+              <w:t>SKPL.md</w:t>
+            </w:r>
+            <w:r>
+              <w:rPr>
+                <w:sz w:val="18"/>
+              </w:rPr>
+              <w:t>).</w:t>
+            </w:r>
+          </w:p>
+        </w:tc>
+        <w:tc>
+          <w:tcPr>
+            <w:tcW w:type="dxa" w:w="1170"/>
+          </w:tcPr>
+          <w:p>
+            <w:r>
+              <w:rPr>
+                <w:sz w:val="18"/>
+              </w:rPr>
+              <w:t>Handal</w:t>
+            </w:r>
+          </w:p>
+        </w:tc>
+      </w:tr>
+    </w:tbl>
+    <w:p>
+      <w:pPr>
+        <w:spacing w:after="80"/>
+      </w:pPr>
+    </w:p>
+    <w:p>
+      <w:pPr>
+        <w:spacing w:after="120"/>
+      </w:pPr>
+      <w:r>
+        <w:rPr>
+          <w:b/>
+        </w:rPr>
+        <w:t>Ringkasan dampak terhadap SKPL:</w:t>
+      </w:r>
+      <w:r>
+        <w:t xml:space="preserve"> Kelima butir uji di atas adalah bukti eksekusi nyata di balik revisi NFR-PAYANA-01 (Revisi D) dan NFR-PAYANA-07 (Revisi E) di </w:t>
+      </w:r>
+      <w:r>
+        <w:rPr>
+          <w:rFonts w:ascii="Consolas" w:hAnsi="Consolas"/>
+          <w:color w:val="C7254E"/>
+          <w:sz w:val="18"/>
+        </w:rPr>
+        <w:t>SKPL.md</w:t>
+      </w:r>
+      <w:r>
+        <w:t xml:space="preserve"> — bukan klaim tanpa data. AU-30-01 secara spesifik mendokumentasikan target awal yang TIDAK tercapai (kejujuran metodologis lebih diutamakan daripada tabel yang seluruhnya hijau); AU-30-02/03/31-01/31-02 mendokumentasikan bukti bahwa sistem tidak pernah gagal (0 5xx) pada seluruh skenario beban yang diuji, termasuk di bawah tekanan yang jauh melebihi kebutuhan nyata skala MVP skripsi ini.</w:t>
+      </w:r>
     </w:p>
     <w:sectPr>
       <w:pgSz w:w="12240" w:h="15840"/>

</xml_diff>